<commit_message>
Major revision: ER-stratified dual-cohort, full clinical baseline, grade/HER2
- Add scripts 35 (ER-neg bootstrap stability) and 36 (full 6-var clinical baseline)
- Extend script 34 ER-stratified to METABRIC: ER+ HR=1.59, ER- HR=0.97 (no signal)
- Incorporate grade and HER2 into harmonization scripts (02_SCANB, 02_METABRIC, 24_GSE1456)
- Full baseline (age+ER+T+N+grade+HER2): CorePAM adds ΔC=+0.015-0.032, LRT p<1e-5
- Update manuscript: Methods, Results, Discussion, Conclusions, Table S7, dowsett2013 ref
- Update reviewer response with dual-cohort ER findings and full baseline
- Update README with scripts 30-36
- QC: 44/44 schema PASS, 8/8 text-vs-results PASS

Co-Authored-By: Claude Opus 4.6 <noreply@anthropic.com>
</commit_message>
<xml_diff>
--- a/submission/CorePAM_manuscript.docx
+++ b/submission/CorePAM_manuscript.docx
@@ -1573,7 +1573,25 @@
         <w:t xml:space="preserve"> </w:t>
       </w:r>
       <w:r>
-        <w:t xml:space="preserve">ER-stratified analyses were performed in SCAN-B (ER status available in 94% of samples). Cox HR and C-index were computed separately for ER-positive and ER-negative subgroups, with an interaction test (score \times ER status).</w:t>
+        <w:t xml:space="preserve">ER-stratified Cox HR, C-index, and formal score\timesER interaction tests were performed in SCAN-B (OS; ER available in 94%) and METABRIC (DSS; ER available in 98%). These analyses were added post hoc in response to reviewer feedback; all other modelling choices remained frozen.</w:t>
+      </w:r>
+    </w:p>
+    <w:p>
+      <w:pPr>
+        <w:pStyle w:val="BodyText"/>
+      </w:pPr>
+      <w:r>
+        <w:rPr>
+          <w:b/>
+          <w:bCs/>
+        </w:rPr>
+        <w:t xml:space="preserve">Full clinical baseline:</w:t>
+      </w:r>
+      <w:r>
+        <w:t xml:space="preserve"> </w:t>
+      </w:r>
+      <w:r>
+        <w:t xml:space="preserve">As a secondary analysis, CorePAM was tested for incremental value beyond a comprehensive 6-variable clinical model (age + ER status + T-stage + N-status + grade + HER2 status) in SCAN-B and METABRIC—the two cohorts where all covariates were available. Incremental value was quantified by \DeltaC-index (bootstrap B = 1,000) and a likelihood ratio test (LRT) comparing the clinical-only versus clinical + CorePAM models. This analysis was also performed restricted to ER-positive patients.</w:t>
       </w:r>
     </w:p>
     <w:p>
@@ -4317,7 +4335,7 @@
         <w:t xml:space="preserve"> </w:t>
       </w:r>
       <w:r>
-        <w:t xml:space="preserve">In SCAN-B (N = 2,870 with ER status), CorePAM was significantly associated with OS in both ER-positive (HR = 1.92; 95% CI 1.69–2.17; p &lt; 0.001; N = 2,646) and ER-negative (HR = 2.53; 95% CI 1.51–4.25; p &lt; 0.001; N = 224) subgroups. The interaction test was not significant (p = 0.25), indicating that the CorePAM prognostic effect does not differ significantly by ER status.</w:t>
+        <w:t xml:space="preserve">In SCAN-B (N = 2,870; OS), CorePAM was significantly associated with survival in both ER-positive (HR = 1.92; 95% CI 1.69–2.17; p &lt; 0.001; N = 2,646) and ER-negative (HR = 2.53; 95% CI 1.51–4.25; p &lt; 0.001; N = 224) subgroups; the interaction test was not significant (p = 0.25). In METABRIC (N = 1,936; DSS), CorePAM was strongly prognostic in ER-positive patients (HR = 1.59; 95% CI 1.44–1.76; p &lt; 0.001; N = 1,497) but showed no signal in ER-negative patients (HR = 0.97; 95% CI 0.82–1.15; p = 0.75; N = 439); the interaction was significant (p = 3.2 \times 10⁻⁷). The discrepancy in ER-negative results reflects statistical power: SCAN-B ER- had only 35 events in 224 patients (bootstrap 95% CI for HR: 1.45–4.89; width = 3.44), whereas METABRIC ER- had 186 events in 439 patients (bootstrap 95% CI: 0.83–1.15; width = 0.32; 10.8\times narrower). The well-powered METABRIC estimate indicates that the clinically meaningful signal is concentrated in ER-positive disease, consistent with the luminal biology of the retained CorePAM genes.</w:t>
       </w:r>
     </w:p>
     <w:bookmarkEnd w:id="80"/>
@@ -4327,7 +4345,7 @@
         <w:pStyle w:val="Heading2"/>
       </w:pPr>
       <w:r>
-        <w:t xml:space="preserve">Independence from anatomical staging</w:t>
+        <w:t xml:space="preserve">Independence from clinical-pathological staging</w:t>
       </w:r>
     </w:p>
     <w:p>
@@ -4336,6 +4354,14 @@
       </w:pPr>
       <w:r>
         <w:t xml:space="preserve">To address whether CorePAM retains prognostic value after adjustment for standard clinical-pathological variables, we fitted expanded multivariable Cox models adjusting for age, ER status (where available), pathological T-stage, and nodal status. T-stage and nodal status were available in 96–100% of samples across the four cohorts with clinical covariates (SCAN-B, TCGA-BRCA, METABRIC, GSE20685). CorePAM remained independently significant in all four (all p &lt; 0.002; Additional file 12: Table S2), with HR change of less than 10% compared to the primary CORE-A baseline. Adding CorePAM to the expanded clinical model increased the C-index by +0.022 to +0.027.</w:t>
+      </w:r>
+    </w:p>
+    <w:p>
+      <w:pPr>
+        <w:pStyle w:val="BodyText"/>
+      </w:pPr>
+      <w:r>
+        <w:t xml:space="preserve">In a comprehensive secondary analysis including all six standard clinical-pathological variables (age, ER status, T-stage, nodal status, histological grade, and HER2 status), CorePAM retained independent significance in both SCAN-B (adjusted HR = 1.75; 95% CI 1.51–2.03; p = 1.6 \times 10⁻¹³; \DeltaC = +0.017) and METABRIC (adjusted HR = 1.25; 95% CI 1.14–1.38; p = 5.5 \times 10⁻⁶; \DeltaC = +0.015). Likelihood ratio tests confirmed that CorePAM adds significant information beyond the full clinical model (both p &lt; 10⁻⁵). In ER-positive patients, the incremental value was most pronounced in METABRIC (\DeltaC = +0.032; 95% CI 0.018–0.050; LRT p = 10⁻¹⁰).</w:t>
       </w:r>
     </w:p>
     <w:bookmarkEnd w:id="81"/>
@@ -5260,7 +5286,13 @@
         <w:t xml:space="preserve"> </w:t>
       </w:r>
       <w:r>
-        <w:t xml:space="preserve">CorePAM was significantly associated with OS in both ER-positive and ER-negative subgroups in SCAN-B, with no significant interaction (p = 0.25). The numerically higher HR in ER-negative patients (2.53 vs 1.92) likely reflects the stronger contribution of proliferation and basal genes in triple-negative biology. However, the small ER-negative sample (N = 224, 35 events) limits the precision of this estimate. Full ER-stratified analysis across all cohorts was not feasible because TCGA-BRCA and GSE20685 lack harmonised ER status.</w:t>
+        <w:t xml:space="preserve">CorePAM is prognostic in unselected cohorts overall, with the clinically meaningful signal concentrated in ER-positive disease. In both SCAN-B and METABRIC, the ER-positive HR was robust (1.92 and 1.59, respectively; both p &lt; 0.001). In ER-negative patients, SCAN-B showed an apparent effect (HR = 2.53) that was not replicated in the better-powered METABRIC analysis (HR = 0.97; N = 439, 186 events). Bootstrap analysis confirmed that the SCAN-B ER-negative estimate is highly unstable (95% CI width = 3.44 vs 0.32 in METABRIC), consistent with its small sample (35 events). This behaviour is consistent with luminal biology and with the clinical use of multigene prognostic assays primarily in ER-positive disease </w:t>
+      </w:r>
+      <w:r>
+        <w:t xml:space="preserve">(Sparano et al. 2018; Dowsett et al. 2013)</w:t>
+      </w:r>
+      <w:r>
+        <w:t xml:space="preserve">.</w:t>
       </w:r>
     </w:p>
     <w:p>
@@ -5272,13 +5304,13 @@
           <w:b/>
           <w:bCs/>
         </w:rPr>
-        <w:t xml:space="preserve">Independence from anatomical staging.</w:t>
-      </w:r>
-      <w:r>
-        <w:t xml:space="preserve"> </w:t>
-      </w:r>
-      <w:r>
-        <w:t xml:space="preserve">An exploratory sensitivity analysis adjusting for pathological T-stage and nodal status—the key clinical-pathological confounders not included in the primary CORE-A baseline—confirmed that CorePAM retains independent prognostic value in all four cohorts (Additional file 12: Table S2). The absolute HR change was less than 10% in all cohorts, and the incremental C-index remained positive (+0.022 to +0.027). This does not alter the primary endpoint or replace the main analyses; it corroborates robustness against pathological confounding.</w:t>
+        <w:t xml:space="preserve">Independence from clinical-pathological staging.</w:t>
+      </w:r>
+      <w:r>
+        <w:t xml:space="preserve"> </w:t>
+      </w:r>
+      <w:r>
+        <w:t xml:space="preserve">CorePAM retained independent prognostic value after adjustment for all six standard clinical-pathological variables (age, ER, T-stage, N-status, grade, HER2) in both SCAN-B (LRT p = 4.9 \times 10⁻¹³) and METABRIC (LRT p = 6.1 \times 10⁻⁶). The \DeltaC of +0.015 to +0.017 over this comprehensive baseline—and +0.032 in ER-positive METABRIC—confirms that CorePAM captures molecular heterogeneity not accessible through routine clinical-pathological assessment.</w:t>
       </w:r>
     </w:p>
     <w:p>
@@ -5356,7 +5388,7 @@
         <w:pStyle w:val="FirstParagraph"/>
       </w:pPr>
       <w:r>
-        <w:t xml:space="preserve">CorePAM is a 24-gene data-driven reduction of the PAM50 panel, derived without pre-specifying gene count, that achieves non-inferior prognostic discrimination relative to a full 50-gene Cox elastic-net model across four independent validation cohorts and two distinct expression platforms (RNA-seq and microarray). The score provides incremental value beyond a clinical baseline model, remains independently significant after adjustment for anatomical staging (T-stage and nodal status), and predicts pathologic complete response to neoadjuvant chemotherapy with high cross-cohort consistency (I² = 0%). The analytical pipeline is fully reproducible from publicly available data.</w:t>
+        <w:t xml:space="preserve">CorePAM is a 24-gene data-driven reduction of the PAM50 panel, derived without pre-specifying gene count, that achieves non-inferior prognostic discrimination relative to a full 50-gene Cox elastic-net model across four independent validation cohorts and two distinct expression platforms (RNA-seq and microarray). The score provides incremental value beyond a comprehensive six-variable clinical baseline (age, ER, T-stage, N-status, grade, HER2; LRT p &lt; 10⁻⁵), with the clinically meaningful signal concentrated in ER-positive disease. CorePAM also predicts pathologic complete response to neoadjuvant chemotherapy with high cross-cohort consistency (I² = 0%). The analytical pipeline is fully reproducible from publicly available data.</w:t>
       </w:r>
     </w:p>
     <w:bookmarkEnd w:id="90"/>
@@ -5550,7 +5582,7 @@
         <w:pStyle w:val="BodyText"/>
       </w:pPr>
       <w:r>
-        <w:t xml:space="preserve">Additional files 1–16 are available as supplementary material. See the Additional files section at the end of this article for descriptions.</w:t>
+        <w:t xml:space="preserve">Additional files 1–17 are available as supplementary material. See the Additional files section at the end of this article for descriptions.</w:t>
       </w:r>
     </w:p>
     <w:p>
@@ -5691,7 +5723,7 @@
       </w:r>
     </w:p>
     <w:bookmarkEnd w:id="92"/>
-    <w:bookmarkStart w:id="180" w:name="additional-files"/>
+    <w:bookmarkStart w:id="182" w:name="additional-files"/>
     <w:p>
       <w:pPr>
         <w:pStyle w:val="Heading1"/>
@@ -10160,8 +10192,674 @@
       </w:tr>
     </w:tbl>
     <w:bookmarkEnd w:id="138"/>
-    <w:bookmarkStart w:id="179" w:name="refs"/>
-    <w:bookmarkStart w:id="139" w:name="ref-blanche2013"/>
+    <w:bookmarkStart w:id="139" w:name="tab:s7-fullbaseline"/>
+    <w:p>
+      <w:pPr>
+        <w:pStyle w:val="TableCaption"/>
+      </w:pPr>
+      <w:r>
+        <w:rPr>
+          <w:b/>
+          <w:bCs/>
+        </w:rPr>
+        <w:t xml:space="preserve">Additional file 17: Table S7.</w:t>
+      </w:r>
+      <w:r>
+        <w:t xml:space="preserve"> </w:t>
+      </w:r>
+      <w:r>
+        <w:t xml:space="preserve">Full clinical baseline incremental value analysis. Cox regression with six clinical-pathological covariates (age, ER, T-stage, N-status, grade, HER2) \pm CorePAM. LRT: likelihood ratio test for CorePAM addition.</w:t>
+      </w:r>
+    </w:p>
+    <w:tbl>
+      <w:tblPr>
+        <w:tblStyle w:val="Table"/>
+        <w:tblW w:type="auto" w:w="0"/>
+        <w:tblLook w:firstRow="1" w:lastRow="0" w:firstColumn="0" w:lastColumn="0" w:noHBand="0" w:noVBand="0" w:val="0020"/>
+        <w:tblCaption w:val="Additional file 17: Table S7. Full clinical baseline incremental value analysis. Cox regression with six clinical-pathological covariates (age, ER, T-stage, N-status, grade, HER2) \pm CorePAM. LRT: likelihood ratio test for CorePAM addition."/>
+      </w:tblPr>
+      <w:tblGrid>
+        <w:gridCol w:w="880"/>
+        <w:gridCol w:w="880"/>
+        <w:gridCol w:w="880"/>
+        <w:gridCol w:w="880"/>
+        <w:gridCol w:w="880"/>
+        <w:gridCol w:w="880"/>
+        <w:gridCol w:w="880"/>
+        <w:gridCol w:w="880"/>
+        <w:gridCol w:w="880"/>
+      </w:tblGrid>
+      <w:tr>
+        <w:trPr>
+          <w:tblHeader w:val="on"/>
+        </w:trPr>
+        <w:tc>
+          <w:tcPr/>
+          <w:p>
+            <w:pPr>
+              <w:pStyle w:val="Compact"/>
+              <w:jc w:val="left"/>
+            </w:pPr>
+            <w:r>
+              <w:t xml:space="preserve">Cohort</w:t>
+            </w:r>
+          </w:p>
+        </w:tc>
+        <w:tc>
+          <w:tcPr/>
+          <w:p>
+            <w:pPr>
+              <w:pStyle w:val="Compact"/>
+              <w:jc w:val="left"/>
+            </w:pPr>
+            <w:r>
+              <w:t xml:space="preserve">Endpoint</w:t>
+            </w:r>
+          </w:p>
+        </w:tc>
+        <w:tc>
+          <w:tcPr/>
+          <w:p>
+            <w:pPr>
+              <w:pStyle w:val="Compact"/>
+              <w:jc w:val="right"/>
+            </w:pPr>
+            <w:r>
+              <w:t xml:space="preserve">Population</w:t>
+            </w:r>
+          </w:p>
+        </w:tc>
+        <w:tc>
+          <w:tcPr/>
+          <w:p>
+            <w:pPr>
+              <w:pStyle w:val="Compact"/>
+              <w:jc w:val="right"/>
+            </w:pPr>
+            <w:r>
+              <w:t xml:space="preserve">N</w:t>
+            </w:r>
+          </w:p>
+        </w:tc>
+        <w:tc>
+          <w:tcPr/>
+          <w:p>
+            <w:pPr>
+              <w:pStyle w:val="Compact"/>
+              <w:jc w:val="center"/>
+            </w:pPr>
+            <w:r>
+              <w:t xml:space="preserve">C clinical</w:t>
+            </w:r>
+          </w:p>
+        </w:tc>
+        <w:tc>
+          <w:tcPr/>
+          <w:p>
+            <w:pPr>
+              <w:pStyle w:val="Compact"/>
+              <w:jc w:val="center"/>
+            </w:pPr>
+            <w:r>
+              <w:t xml:space="preserve">C clin+CorePAM</w:t>
+            </w:r>
+          </w:p>
+        </w:tc>
+        <w:tc>
+          <w:tcPr/>
+          <w:p>
+            <w:pPr>
+              <w:pStyle w:val="Compact"/>
+              <w:jc w:val="center"/>
+            </w:pPr>
+            <w:r>
+              <w:t xml:space="preserve">\DeltaC</w:t>
+            </w:r>
+          </w:p>
+        </w:tc>
+        <w:tc>
+          <w:tcPr/>
+          <w:p>
+            <w:pPr>
+              <w:pStyle w:val="Compact"/>
+              <w:jc w:val="center"/>
+            </w:pPr>
+            <w:r>
+              <w:t xml:space="preserve">LRT p</w:t>
+            </w:r>
+          </w:p>
+        </w:tc>
+        <w:tc>
+          <w:tcPr/>
+          <w:p>
+            <w:pPr>
+              <w:pStyle w:val="Compact"/>
+              <w:jc w:val="center"/>
+            </w:pPr>
+            <w:r>
+              <w:t xml:space="preserve">HRadⱼ</w:t>
+            </w:r>
+          </w:p>
+        </w:tc>
+      </w:tr>
+      <w:tr>
+        <w:tc>
+          <w:tcPr/>
+          <w:p>
+            <w:pPr>
+              <w:pStyle w:val="Compact"/>
+              <w:jc w:val="left"/>
+            </w:pPr>
+            <w:r>
+              <w:t xml:space="preserve">SCAN-B</w:t>
+            </w:r>
+          </w:p>
+        </w:tc>
+        <w:tc>
+          <w:tcPr/>
+          <w:p>
+            <w:pPr>
+              <w:pStyle w:val="Compact"/>
+              <w:jc w:val="left"/>
+            </w:pPr>
+            <w:r>
+              <w:t xml:space="preserve">OS</w:t>
+            </w:r>
+          </w:p>
+        </w:tc>
+        <w:tc>
+          <w:tcPr/>
+          <w:p>
+            <w:pPr>
+              <w:pStyle w:val="Compact"/>
+              <w:jc w:val="right"/>
+            </w:pPr>
+            <w:r>
+              <w:t xml:space="preserve">All</w:t>
+            </w:r>
+          </w:p>
+        </w:tc>
+        <w:tc>
+          <w:tcPr/>
+          <w:p>
+            <w:pPr>
+              <w:pStyle w:val="Compact"/>
+              <w:jc w:val="right"/>
+            </w:pPr>
+            <w:r>
+              <w:t xml:space="preserve">2,649</w:t>
+            </w:r>
+          </w:p>
+        </w:tc>
+        <w:tc>
+          <w:tcPr/>
+          <w:p>
+            <w:pPr>
+              <w:pStyle w:val="Compact"/>
+              <w:jc w:val="center"/>
+            </w:pPr>
+            <w:r>
+              <w:t xml:space="preserve">0.770</w:t>
+            </w:r>
+          </w:p>
+        </w:tc>
+        <w:tc>
+          <w:tcPr/>
+          <w:p>
+            <w:pPr>
+              <w:pStyle w:val="Compact"/>
+              <w:jc w:val="center"/>
+            </w:pPr>
+            <w:r>
+              <w:t xml:space="preserve">0.787</w:t>
+            </w:r>
+          </w:p>
+        </w:tc>
+        <w:tc>
+          <w:tcPr/>
+          <w:p>
+            <w:pPr>
+              <w:pStyle w:val="Compact"/>
+              <w:jc w:val="center"/>
+            </w:pPr>
+            <w:r>
+              <w:t xml:space="preserve">+0.017</w:t>
+            </w:r>
+          </w:p>
+        </w:tc>
+        <w:tc>
+          <w:tcPr/>
+          <w:p>
+            <w:pPr>
+              <w:pStyle w:val="Compact"/>
+              <w:jc w:val="center"/>
+            </w:pPr>
+            <w:r>
+              <w:t xml:space="preserve">4.9 \times 10⁻¹³</w:t>
+            </w:r>
+          </w:p>
+        </w:tc>
+        <w:tc>
+          <w:tcPr/>
+          <w:p>
+            <w:pPr>
+              <w:pStyle w:val="Compact"/>
+              <w:jc w:val="center"/>
+            </w:pPr>
+            <w:r>
+              <w:t xml:space="preserve">1.75</w:t>
+            </w:r>
+          </w:p>
+        </w:tc>
+      </w:tr>
+      <w:tr>
+        <w:tc>
+          <w:tcPr/>
+          <w:p>
+            <w:pPr>
+              <w:pStyle w:val="Compact"/>
+              <w:jc w:val="left"/>
+            </w:pPr>
+            <w:r>
+              <w:t xml:space="preserve">SCAN-B</w:t>
+            </w:r>
+          </w:p>
+        </w:tc>
+        <w:tc>
+          <w:tcPr/>
+          <w:p>
+            <w:pPr>
+              <w:pStyle w:val="Compact"/>
+              <w:jc w:val="left"/>
+            </w:pPr>
+            <w:r>
+              <w:t xml:space="preserve">OS</w:t>
+            </w:r>
+          </w:p>
+        </w:tc>
+        <w:tc>
+          <w:tcPr/>
+          <w:p>
+            <w:pPr>
+              <w:pStyle w:val="Compact"/>
+              <w:jc w:val="right"/>
+            </w:pPr>
+            <w:r>
+              <w:t xml:space="preserve">ER+</w:t>
+            </w:r>
+          </w:p>
+        </w:tc>
+        <w:tc>
+          <w:tcPr/>
+          <w:p>
+            <w:pPr>
+              <w:pStyle w:val="Compact"/>
+              <w:jc w:val="right"/>
+            </w:pPr>
+            <w:r>
+              <w:t xml:space="preserve">2,450</w:t>
+            </w:r>
+          </w:p>
+        </w:tc>
+        <w:tc>
+          <w:tcPr/>
+          <w:p>
+            <w:pPr>
+              <w:pStyle w:val="Compact"/>
+              <w:jc w:val="center"/>
+            </w:pPr>
+            <w:r>
+              <w:t xml:space="preserve">0.770</w:t>
+            </w:r>
+          </w:p>
+        </w:tc>
+        <w:tc>
+          <w:tcPr/>
+          <w:p>
+            <w:pPr>
+              <w:pStyle w:val="Compact"/>
+              <w:jc w:val="center"/>
+            </w:pPr>
+            <w:r>
+              <w:t xml:space="preserve">0.784</w:t>
+            </w:r>
+          </w:p>
+        </w:tc>
+        <w:tc>
+          <w:tcPr/>
+          <w:p>
+            <w:pPr>
+              <w:pStyle w:val="Compact"/>
+              <w:jc w:val="center"/>
+            </w:pPr>
+            <w:r>
+              <w:t xml:space="preserve">+0.014</w:t>
+            </w:r>
+          </w:p>
+        </w:tc>
+        <w:tc>
+          <w:tcPr/>
+          <w:p>
+            <w:pPr>
+              <w:pStyle w:val="Compact"/>
+              <w:jc w:val="center"/>
+            </w:pPr>
+            <w:r>
+              <w:t xml:space="preserve">1.1 \times 10⁻¹⁰</w:t>
+            </w:r>
+          </w:p>
+        </w:tc>
+        <w:tc>
+          <w:tcPr/>
+          <w:p>
+            <w:pPr>
+              <w:pStyle w:val="Compact"/>
+              <w:jc w:val="center"/>
+            </w:pPr>
+            <w:r>
+              <w:t xml:space="preserve">1.68</w:t>
+            </w:r>
+          </w:p>
+        </w:tc>
+      </w:tr>
+      <w:tr>
+        <w:tc>
+          <w:tcPr/>
+          <w:p>
+            <w:pPr>
+              <w:pStyle w:val="Compact"/>
+              <w:jc w:val="left"/>
+            </w:pPr>
+            <w:r>
+              <w:t xml:space="preserve">METABRIC</w:t>
+            </w:r>
+          </w:p>
+        </w:tc>
+        <w:tc>
+          <w:tcPr/>
+          <w:p>
+            <w:pPr>
+              <w:pStyle w:val="Compact"/>
+              <w:jc w:val="left"/>
+            </w:pPr>
+            <w:r>
+              <w:t xml:space="preserve">DSS</w:t>
+            </w:r>
+          </w:p>
+        </w:tc>
+        <w:tc>
+          <w:tcPr/>
+          <w:p>
+            <w:pPr>
+              <w:pStyle w:val="Compact"/>
+              <w:jc w:val="right"/>
+            </w:pPr>
+            <w:r>
+              <w:t xml:space="preserve">All</w:t>
+            </w:r>
+          </w:p>
+        </w:tc>
+        <w:tc>
+          <w:tcPr/>
+          <w:p>
+            <w:pPr>
+              <w:pStyle w:val="Compact"/>
+              <w:jc w:val="right"/>
+            </w:pPr>
+            <w:r>
+              <w:t xml:space="preserve">1,792</w:t>
+            </w:r>
+          </w:p>
+        </w:tc>
+        <w:tc>
+          <w:tcPr/>
+          <w:p>
+            <w:pPr>
+              <w:pStyle w:val="Compact"/>
+              <w:jc w:val="center"/>
+            </w:pPr>
+            <w:r>
+              <w:t xml:space="preserve">0.678</w:t>
+            </w:r>
+          </w:p>
+        </w:tc>
+        <w:tc>
+          <w:tcPr/>
+          <w:p>
+            <w:pPr>
+              <w:pStyle w:val="Compact"/>
+              <w:jc w:val="center"/>
+            </w:pPr>
+            <w:r>
+              <w:t xml:space="preserve">0.693</w:t>
+            </w:r>
+          </w:p>
+        </w:tc>
+        <w:tc>
+          <w:tcPr/>
+          <w:p>
+            <w:pPr>
+              <w:pStyle w:val="Compact"/>
+              <w:jc w:val="center"/>
+            </w:pPr>
+            <w:r>
+              <w:t xml:space="preserve">+0.015</w:t>
+            </w:r>
+          </w:p>
+        </w:tc>
+        <w:tc>
+          <w:tcPr/>
+          <w:p>
+            <w:pPr>
+              <w:pStyle w:val="Compact"/>
+              <w:jc w:val="center"/>
+            </w:pPr>
+            <w:r>
+              <w:t xml:space="preserve">6.1 \times 10⁻⁶</w:t>
+            </w:r>
+          </w:p>
+        </w:tc>
+        <w:tc>
+          <w:tcPr/>
+          <w:p>
+            <w:pPr>
+              <w:pStyle w:val="Compact"/>
+              <w:jc w:val="center"/>
+            </w:pPr>
+            <w:r>
+              <w:t xml:space="preserve">1.25</w:t>
+            </w:r>
+          </w:p>
+        </w:tc>
+      </w:tr>
+      <w:tr>
+        <w:tc>
+          <w:tcPr/>
+          <w:p>
+            <w:pPr>
+              <w:pStyle w:val="Compact"/>
+              <w:jc w:val="left"/>
+            </w:pPr>
+            <w:r>
+              <w:t xml:space="preserve">METABRIC</w:t>
+            </w:r>
+          </w:p>
+        </w:tc>
+        <w:tc>
+          <w:tcPr/>
+          <w:p>
+            <w:pPr>
+              <w:pStyle w:val="Compact"/>
+              <w:jc w:val="left"/>
+            </w:pPr>
+            <w:r>
+              <w:t xml:space="preserve">DSS</w:t>
+            </w:r>
+          </w:p>
+        </w:tc>
+        <w:tc>
+          <w:tcPr/>
+          <w:p>
+            <w:pPr>
+              <w:pStyle w:val="Compact"/>
+              <w:jc w:val="right"/>
+            </w:pPr>
+            <w:r>
+              <w:t xml:space="preserve">ER+</w:t>
+            </w:r>
+          </w:p>
+        </w:tc>
+        <w:tc>
+          <w:tcPr/>
+          <w:p>
+            <w:pPr>
+              <w:pStyle w:val="Compact"/>
+              <w:jc w:val="right"/>
+            </w:pPr>
+            <w:r>
+              <w:t xml:space="preserve">1,377</w:t>
+            </w:r>
+          </w:p>
+        </w:tc>
+        <w:tc>
+          <w:tcPr/>
+          <w:p>
+            <w:pPr>
+              <w:pStyle w:val="Compact"/>
+              <w:jc w:val="center"/>
+            </w:pPr>
+            <w:r>
+              <w:t xml:space="preserve">0.674</w:t>
+            </w:r>
+          </w:p>
+        </w:tc>
+        <w:tc>
+          <w:tcPr/>
+          <w:p>
+            <w:pPr>
+              <w:pStyle w:val="Compact"/>
+              <w:jc w:val="center"/>
+            </w:pPr>
+            <w:r>
+              <w:t xml:space="preserve">0.707</w:t>
+            </w:r>
+          </w:p>
+        </w:tc>
+        <w:tc>
+          <w:tcPr/>
+          <w:p>
+            <w:pPr>
+              <w:pStyle w:val="Compact"/>
+              <w:jc w:val="center"/>
+            </w:pPr>
+            <w:r>
+              <w:t xml:space="preserve">+0.032</w:t>
+            </w:r>
+          </w:p>
+        </w:tc>
+        <w:tc>
+          <w:tcPr/>
+          <w:p>
+            <w:pPr>
+              <w:pStyle w:val="Compact"/>
+              <w:jc w:val="center"/>
+            </w:pPr>
+            <w:r>
+              <w:t xml:space="preserve">1.0 \times 10⁻¹⁰</w:t>
+            </w:r>
+          </w:p>
+        </w:tc>
+        <w:tc>
+          <w:tcPr/>
+          <w:p>
+            <w:pPr>
+              <w:pStyle w:val="Compact"/>
+              <w:jc w:val="center"/>
+            </w:pPr>
+            <w:r>
+              <w:t xml:space="preserve">1.47</w:t>
+            </w:r>
+          </w:p>
+        </w:tc>
+      </w:tr>
+      <w:tr>
+        <w:tc>
+          <w:tcPr/>
+          <w:p>
+            <w:pPr>
+              <w:pStyle w:val="Compact"/>
+            </w:pPr>
+          </w:p>
+        </w:tc>
+        <w:tc>
+          <w:tcPr/>
+          <w:p>
+            <w:pPr>
+              <w:pStyle w:val="Compact"/>
+            </w:pPr>
+          </w:p>
+        </w:tc>
+        <w:tc>
+          <w:tcPr/>
+          <w:p>
+            <w:pPr>
+              <w:pStyle w:val="Compact"/>
+            </w:pPr>
+          </w:p>
+        </w:tc>
+        <w:tc>
+          <w:tcPr/>
+          <w:p>
+            <w:pPr>
+              <w:pStyle w:val="Compact"/>
+            </w:pPr>
+          </w:p>
+        </w:tc>
+        <w:tc>
+          <w:tcPr/>
+          <w:p>
+            <w:pPr>
+              <w:pStyle w:val="Compact"/>
+            </w:pPr>
+          </w:p>
+        </w:tc>
+        <w:tc>
+          <w:tcPr/>
+          <w:p>
+            <w:pPr>
+              <w:pStyle w:val="Compact"/>
+            </w:pPr>
+          </w:p>
+        </w:tc>
+        <w:tc>
+          <w:tcPr/>
+          <w:p>
+            <w:pPr>
+              <w:pStyle w:val="Compact"/>
+            </w:pPr>
+          </w:p>
+        </w:tc>
+        <w:tc>
+          <w:tcPr/>
+          <w:p>
+            <w:pPr>
+              <w:pStyle w:val="Compact"/>
+            </w:pPr>
+          </w:p>
+        </w:tc>
+        <w:tc>
+          <w:tcPr/>
+          <w:p>
+            <w:pPr>
+              <w:pStyle w:val="Compact"/>
+            </w:pPr>
+          </w:p>
+        </w:tc>
+      </w:tr>
+    </w:tbl>
+    <w:bookmarkEnd w:id="139"/>
+    <w:bookmarkStart w:id="181" w:name="refs"/>
+    <w:bookmarkStart w:id="140" w:name="ref-blanche2013"/>
     <w:p>
       <w:pPr>
         <w:pStyle w:val="Bibliography"/>
@@ -10192,8 +10890,8 @@
         <w:t xml:space="preserve">32 (30): 5381–97.</w:t>
       </w:r>
     </w:p>
-    <w:bookmarkEnd w:id="139"/>
-    <w:bookmarkStart w:id="140" w:name="ref-botan2026"/>
+    <w:bookmarkEnd w:id="140"/>
+    <w:bookmarkStart w:id="141" w:name="ref-botan2026"/>
     <w:p>
       <w:pPr>
         <w:pStyle w:val="Bibliography"/>
@@ -10240,8 +10938,8 @@
         <w:t xml:space="preserve">.</w:t>
       </w:r>
     </w:p>
-    <w:bookmarkEnd w:id="140"/>
-    <w:bookmarkStart w:id="141" w:name="ref-brueffer2018"/>
+    <w:bookmarkEnd w:id="141"/>
+    <w:bookmarkStart w:id="142" w:name="ref-brueffer2018"/>
     <w:p>
       <w:pPr>
         <w:pStyle w:val="Bibliography"/>
@@ -10296,8 +10994,8 @@
         <w:t xml:space="preserve">2: 1–18.</w:t>
       </w:r>
     </w:p>
-    <w:bookmarkEnd w:id="141"/>
-    <w:bookmarkStart w:id="142" w:name="ref-tcga2012"/>
+    <w:bookmarkEnd w:id="142"/>
+    <w:bookmarkStart w:id="143" w:name="ref-tcga2012"/>
     <w:p>
       <w:pPr>
         <w:pStyle w:val="Bibliography"/>
@@ -10328,8 +11026,8 @@
         <w:t xml:space="preserve">490 (7418): 61–70.</w:t>
       </w:r>
     </w:p>
-    <w:bookmarkEnd w:id="142"/>
-    <w:bookmarkStart w:id="143" w:name="ref-cardoso2016"/>
+    <w:bookmarkEnd w:id="143"/>
+    <w:bookmarkStart w:id="144" w:name="ref-cardoso2016"/>
     <w:p>
       <w:pPr>
         <w:pStyle w:val="Bibliography"/>
@@ -10360,8 +11058,8 @@
         <w:t xml:space="preserve">375 (8): 717–29.</w:t>
       </w:r>
     </w:p>
-    <w:bookmarkEnd w:id="143"/>
-    <w:bookmarkStart w:id="144" w:name="ref-curtis2012"/>
+    <w:bookmarkEnd w:id="144"/>
+    <w:bookmarkStart w:id="145" w:name="ref-curtis2012"/>
     <w:p>
       <w:pPr>
         <w:pStyle w:val="Bibliography"/>
@@ -10392,8 +11090,8 @@
         <w:t xml:space="preserve">486 (7403): 346–52.</w:t>
       </w:r>
     </w:p>
-    <w:bookmarkEnd w:id="144"/>
-    <w:bookmarkStart w:id="145" w:name="ref-dersimonian1986"/>
+    <w:bookmarkEnd w:id="145"/>
+    <w:bookmarkStart w:id="146" w:name="ref-dersimonian1986"/>
     <w:p>
       <w:pPr>
         <w:pStyle w:val="Bibliography"/>
@@ -10424,8 +11122,85 @@
         <w:t xml:space="preserve">7 (3): 177–88.</w:t>
       </w:r>
     </w:p>
-    <w:bookmarkEnd w:id="145"/>
-    <w:bookmarkStart w:id="146" w:name="ref-esserman2012"/>
+    <w:bookmarkEnd w:id="146"/>
+    <w:bookmarkStart w:id="147" w:name="ref-dowsett2013"/>
+    <w:p>
+      <w:pPr>
+        <w:pStyle w:val="Bibliography"/>
+      </w:pPr>
+      <w:r>
+        <w:t xml:space="preserve">Dowsett, Mitch, Ivana Sestak, Elena Lopez-Knowles, Kally Sidhu, Anita K. Dunbier, J. Wayne Cowens, Sean Ferree, James Storhoff, Christopher Schaper, and Jack Cuzick. 2013.</w:t>
+      </w:r>
+      <w:r>
+        <w:t xml:space="preserve"> </w:t>
+      </w:r>
+      <w:r>
+        <w:t xml:space="preserve">“Comparison of</w:t>
+      </w:r>
+      <w:r>
+        <w:t xml:space="preserve"> </w:t>
+      </w:r>
+      <w:r>
+        <w:t xml:space="preserve">PAM50</w:t>
+      </w:r>
+      <w:r>
+        <w:t xml:space="preserve"> </w:t>
+      </w:r>
+      <w:r>
+        <w:t xml:space="preserve">Risk of Recurrence Score with</w:t>
+      </w:r>
+      <w:r>
+        <w:t xml:space="preserve"> </w:t>
+      </w:r>
+      <w:r>
+        <w:t xml:space="preserve">O</w:t>
+      </w:r>
+      <w:r>
+        <w:t xml:space="preserve">ncotype</w:t>
+      </w:r>
+      <w:r>
+        <w:t xml:space="preserve"> </w:t>
+      </w:r>
+      <w:r>
+        <w:t xml:space="preserve">DX</w:t>
+      </w:r>
+      <w:r>
+        <w:t xml:space="preserve"> </w:t>
+      </w:r>
+      <w:r>
+        <w:t xml:space="preserve">and</w:t>
+      </w:r>
+      <w:r>
+        <w:t xml:space="preserve"> </w:t>
+      </w:r>
+      <w:r>
+        <w:t xml:space="preserve">IHC4</w:t>
+      </w:r>
+      <w:r>
+        <w:t xml:space="preserve"> </w:t>
+      </w:r>
+      <w:r>
+        <w:t xml:space="preserve">for Predicting Risk of Distant Recurrence After Endocrine Therapy.”</w:t>
+      </w:r>
+      <w:r>
+        <w:t xml:space="preserve"> </w:t>
+      </w:r>
+      <w:r>
+        <w:rPr>
+          <w:i/>
+          <w:iCs/>
+        </w:rPr>
+        <w:t xml:space="preserve">J Clin Oncol</w:t>
+      </w:r>
+      <w:r>
+        <w:t xml:space="preserve"> </w:t>
+      </w:r>
+      <w:r>
+        <w:t xml:space="preserve">31 (22): 2783–90.</w:t>
+      </w:r>
+    </w:p>
+    <w:bookmarkEnd w:id="147"/>
+    <w:bookmarkStart w:id="148" w:name="ref-esserman2012"/>
     <w:p>
       <w:pPr>
         <w:pStyle w:val="Bibliography"/>
@@ -10465,8 +11240,8 @@
         <w:t xml:space="preserve">132 (3): 1049–62.</w:t>
       </w:r>
     </w:p>
-    <w:bookmarkEnd w:id="146"/>
-    <w:bookmarkStart w:id="147" w:name="ref-fine1999"/>
+    <w:bookmarkEnd w:id="148"/>
+    <w:bookmarkStart w:id="149" w:name="ref-fine1999"/>
     <w:p>
       <w:pPr>
         <w:pStyle w:val="Bibliography"/>
@@ -10497,8 +11272,8 @@
         <w:t xml:space="preserve">94 (446): 496–509.</w:t>
       </w:r>
     </w:p>
-    <w:bookmarkEnd w:id="147"/>
-    <w:bookmarkStart w:id="148" w:name="ref-friedman2010"/>
+    <w:bookmarkEnd w:id="149"/>
+    <w:bookmarkStart w:id="150" w:name="ref-friedman2010"/>
     <w:p>
       <w:pPr>
         <w:pStyle w:val="Bibliography"/>
@@ -10529,8 +11304,8 @@
         <w:t xml:space="preserve">33 (1): 1–22.</w:t>
       </w:r>
     </w:p>
-    <w:bookmarkEnd w:id="148"/>
-    <w:bookmarkStart w:id="149" w:name="ref-gendoo2016"/>
+    <w:bookmarkEnd w:id="150"/>
+    <w:bookmarkStart w:id="151" w:name="ref-gendoo2016"/>
     <w:p>
       <w:pPr>
         <w:pStyle w:val="Bibliography"/>
@@ -10573,8 +11348,8 @@
         <w:t xml:space="preserve">32 (7): 1097–99.</w:t>
       </w:r>
     </w:p>
-    <w:bookmarkEnd w:id="149"/>
-    <w:bookmarkStart w:id="150" w:name="ref-grambsch1994"/>
+    <w:bookmarkEnd w:id="151"/>
+    <w:bookmarkStart w:id="152" w:name="ref-grambsch1994"/>
     <w:p>
       <w:pPr>
         <w:pStyle w:val="Bibliography"/>
@@ -10605,8 +11380,8 @@
         <w:t xml:space="preserve">81 (3): 515–26.</w:t>
       </w:r>
     </w:p>
-    <w:bookmarkEnd w:id="150"/>
-    <w:bookmarkStart w:id="151" w:name="ref-harrell1982"/>
+    <w:bookmarkEnd w:id="152"/>
+    <w:bookmarkStart w:id="153" w:name="ref-harrell1982"/>
     <w:p>
       <w:pPr>
         <w:pStyle w:val="Bibliography"/>
@@ -10637,8 +11412,8 @@
         <w:t xml:space="preserve">247 (18): 2543–46.</w:t>
       </w:r>
     </w:p>
-    <w:bookmarkEnd w:id="151"/>
-    <w:bookmarkStart w:id="152" w:name="ref-hartung2001"/>
+    <w:bookmarkEnd w:id="153"/>
+    <w:bookmarkStart w:id="154" w:name="ref-hartung2001"/>
     <w:p>
       <w:pPr>
         <w:pStyle w:val="Bibliography"/>
@@ -10669,8 +11444,8 @@
         <w:t xml:space="preserve">20 (24): 3875–89.</w:t>
       </w:r>
     </w:p>
-    <w:bookmarkEnd w:id="152"/>
-    <w:bookmarkStart w:id="153" w:name="ref-hatzis2011"/>
+    <w:bookmarkEnd w:id="154"/>
+    <w:bookmarkStart w:id="155" w:name="ref-hatzis2011"/>
     <w:p>
       <w:pPr>
         <w:pStyle w:val="Bibliography"/>
@@ -10701,8 +11476,8 @@
         <w:t xml:space="preserve">305 (18): 1873–81.</w:t>
       </w:r>
     </w:p>
-    <w:bookmarkEnd w:id="153"/>
-    <w:bookmarkStart w:id="154" w:name="ref-higgins2003"/>
+    <w:bookmarkEnd w:id="155"/>
+    <w:bookmarkStart w:id="156" w:name="ref-higgins2003"/>
     <w:p>
       <w:pPr>
         <w:pStyle w:val="Bibliography"/>
@@ -10733,8 +11508,8 @@
         <w:t xml:space="preserve">327 (7414): 557–60.</w:t>
       </w:r>
     </w:p>
-    <w:bookmarkEnd w:id="154"/>
-    <w:bookmarkStart w:id="155" w:name="ref-kao2011"/>
+    <w:bookmarkEnd w:id="156"/>
+    <w:bookmarkStart w:id="157" w:name="ref-kao2011"/>
     <w:p>
       <w:pPr>
         <w:pStyle w:val="Bibliography"/>
@@ -10765,8 +11540,8 @@
         <w:t xml:space="preserve">11: 143.</w:t>
       </w:r>
     </w:p>
-    <w:bookmarkEnd w:id="155"/>
-    <w:bookmarkStart w:id="156" w:name="ref-maqc2010"/>
+    <w:bookmarkEnd w:id="157"/>
+    <w:bookmarkStart w:id="158" w:name="ref-maqc2010"/>
     <w:p>
       <w:pPr>
         <w:pStyle w:val="Bibliography"/>
@@ -10809,8 +11584,8 @@
         <w:t xml:space="preserve">28 (8): 827–38.</w:t>
       </w:r>
     </w:p>
-    <w:bookmarkEnd w:id="156"/>
-    <w:bookmarkStart w:id="157" w:name="ref-miyake2012"/>
+    <w:bookmarkEnd w:id="158"/>
+    <w:bookmarkStart w:id="159" w:name="ref-miyake2012"/>
     <w:p>
       <w:pPr>
         <w:pStyle w:val="Bibliography"/>
@@ -10859,8 +11634,8 @@
         <w:t xml:space="preserve">103 (5): 913–20.</w:t>
       </w:r>
     </w:p>
-    <w:bookmarkEnd w:id="157"/>
-    <w:bookmarkStart w:id="158" w:name="ref-moons2015"/>
+    <w:bookmarkEnd w:id="159"/>
+    <w:bookmarkStart w:id="160" w:name="ref-moons2015"/>
     <w:p>
       <w:pPr>
         <w:pStyle w:val="Bibliography"/>
@@ -10933,8 +11708,8 @@
         <w:t xml:space="preserve">162 (1): W1–73.</w:t>
       </w:r>
     </w:p>
-    <w:bookmarkEnd w:id="158"/>
-    <w:bookmarkStart w:id="159" w:name="ref-nielsen2014"/>
+    <w:bookmarkEnd w:id="160"/>
+    <w:bookmarkStart w:id="161" w:name="ref-nielsen2014"/>
     <w:p>
       <w:pPr>
         <w:pStyle w:val="Bibliography"/>
@@ -10998,8 +11773,8 @@
         <w:t xml:space="preserve">14: 177.</w:t>
       </w:r>
     </w:p>
-    <w:bookmarkEnd w:id="159"/>
-    <w:bookmarkStart w:id="160" w:name="ref-paik2004"/>
+    <w:bookmarkEnd w:id="161"/>
+    <w:bookmarkStart w:id="162" w:name="ref-paik2004"/>
     <w:p>
       <w:pPr>
         <w:pStyle w:val="Bibliography"/>
@@ -11030,8 +11805,8 @@
         <w:t xml:space="preserve">351 (27): 2817–26.</w:t>
       </w:r>
     </w:p>
-    <w:bookmarkEnd w:id="160"/>
-    <w:bookmarkStart w:id="161" w:name="ref-parker2009"/>
+    <w:bookmarkEnd w:id="162"/>
+    <w:bookmarkStart w:id="163" w:name="ref-parker2009"/>
     <w:p>
       <w:pPr>
         <w:pStyle w:val="Bibliography"/>
@@ -11062,8 +11837,8 @@
         <w:t xml:space="preserve">27 (8): 1160–67.</w:t>
       </w:r>
     </w:p>
-    <w:bookmarkEnd w:id="161"/>
-    <w:bookmarkStart w:id="162" w:name="ref-pawitan2005"/>
+    <w:bookmarkEnd w:id="163"/>
+    <w:bookmarkStart w:id="164" w:name="ref-pawitan2005"/>
     <w:p>
       <w:pPr>
         <w:pStyle w:val="Bibliography"/>
@@ -11094,8 +11869,8 @@
         <w:t xml:space="preserve">7 (6): R953–64.</w:t>
       </w:r>
     </w:p>
-    <w:bookmarkEnd w:id="162"/>
-    <w:bookmarkStart w:id="163" w:name="ref-perou2000"/>
+    <w:bookmarkEnd w:id="164"/>
+    <w:bookmarkStart w:id="165" w:name="ref-perou2000"/>
     <w:p>
       <w:pPr>
         <w:pStyle w:val="Bibliography"/>
@@ -11126,8 +11901,8 @@
         <w:t xml:space="preserve">406 (6797): 747–52.</w:t>
       </w:r>
     </w:p>
-    <w:bookmarkEnd w:id="163"/>
-    <w:bookmarkStart w:id="164" w:name="ref-prat2015"/>
+    <w:bookmarkEnd w:id="165"/>
+    <w:bookmarkStart w:id="166" w:name="ref-prat2015"/>
     <w:p>
       <w:pPr>
         <w:pStyle w:val="Bibliography"/>
@@ -11158,8 +11933,8 @@
         <w:t xml:space="preserve">13: 303.</w:t>
       </w:r>
     </w:p>
-    <w:bookmarkEnd w:id="164"/>
-    <w:bookmarkStart w:id="165" w:name="ref-robinson2010"/>
+    <w:bookmarkEnd w:id="166"/>
+    <w:bookmarkStart w:id="167" w:name="ref-robinson2010"/>
     <w:p>
       <w:pPr>
         <w:pStyle w:val="Bibliography"/>
@@ -11205,8 +11980,8 @@
         <w:t xml:space="preserve">26 (1): 139–40.</w:t>
       </w:r>
     </w:p>
-    <w:bookmarkEnd w:id="165"/>
-    <w:bookmarkStart w:id="166" w:name="ref-royston2004"/>
+    <w:bookmarkEnd w:id="167"/>
+    <w:bookmarkStart w:id="168" w:name="ref-royston2004"/>
     <w:p>
       <w:pPr>
         <w:pStyle w:val="Bibliography"/>
@@ -11246,8 +12021,8 @@
         <w:t xml:space="preserve">13: 33.</w:t>
       </w:r>
     </w:p>
-    <w:bookmarkEnd w:id="166"/>
-    <w:bookmarkStart w:id="167" w:name="ref-saal2015"/>
+    <w:bookmarkEnd w:id="168"/>
+    <w:bookmarkStart w:id="169" w:name="ref-saal2015"/>
     <w:p>
       <w:pPr>
         <w:pStyle w:val="Bibliography"/>
@@ -11287,8 +12062,8 @@
         <w:t xml:space="preserve">7: 20.</w:t>
       </w:r>
     </w:p>
-    <w:bookmarkEnd w:id="167"/>
-    <w:bookmarkStart w:id="168" w:name="ref-simon2011"/>
+    <w:bookmarkEnd w:id="169"/>
+    <w:bookmarkStart w:id="170" w:name="ref-simon2011"/>
     <w:p>
       <w:pPr>
         <w:pStyle w:val="Bibliography"/>
@@ -11328,8 +12103,8 @@
         <w:t xml:space="preserve">39 (5): 1–13.</w:t>
       </w:r>
     </w:p>
-    <w:bookmarkEnd w:id="168"/>
-    <w:bookmarkStart w:id="169" w:name="ref-sorlie2001"/>
+    <w:bookmarkEnd w:id="170"/>
+    <w:bookmarkStart w:id="171" w:name="ref-sorlie2001"/>
     <w:p>
       <w:pPr>
         <w:pStyle w:val="Bibliography"/>
@@ -11360,8 +12135,8 @@
         <w:t xml:space="preserve">98 (19): 10869–74.</w:t>
       </w:r>
     </w:p>
-    <w:bookmarkEnd w:id="169"/>
-    <w:bookmarkStart w:id="170" w:name="ref-sparano2018"/>
+    <w:bookmarkEnd w:id="171"/>
+    <w:bookmarkStart w:id="172" w:name="ref-sparano2018"/>
     <w:p>
       <w:pPr>
         <w:pStyle w:val="Bibliography"/>
@@ -11392,8 +12167,8 @@
         <w:t xml:space="preserve">379 (2): 111–21.</w:t>
       </w:r>
     </w:p>
-    <w:bookmarkEnd w:id="170"/>
-    <w:bookmarkStart w:id="171" w:name="ref-therneau2000"/>
+    <w:bookmarkEnd w:id="172"/>
+    <w:bookmarkStart w:id="173" w:name="ref-therneau2000"/>
     <w:p>
       <w:pPr>
         <w:pStyle w:val="Bibliography"/>
@@ -11436,8 +12211,8 @@
         <w:t xml:space="preserve">. New York: Springer.</w:t>
       </w:r>
     </w:p>
-    <w:bookmarkEnd w:id="171"/>
-    <w:bookmarkStart w:id="172" w:name="ref-tibshirani1997"/>
+    <w:bookmarkEnd w:id="173"/>
+    <w:bookmarkStart w:id="174" w:name="ref-tibshirani1997"/>
     <w:p>
       <w:pPr>
         <w:pStyle w:val="Bibliography"/>
@@ -11477,8 +12252,8 @@
         <w:t xml:space="preserve">16 (4): 385–95.</w:t>
       </w:r>
     </w:p>
-    <w:bookmarkEnd w:id="172"/>
-    <w:bookmarkStart w:id="173" w:name="ref-uno2011"/>
+    <w:bookmarkEnd w:id="174"/>
+    <w:bookmarkStart w:id="175" w:name="ref-uno2011"/>
     <w:p>
       <w:pPr>
         <w:pStyle w:val="Bibliography"/>
@@ -11518,8 +12293,8 @@
         <w:t xml:space="preserve">30 (10): 1105–17.</w:t>
       </w:r>
     </w:p>
-    <w:bookmarkEnd w:id="173"/>
-    <w:bookmarkStart w:id="174" w:name="ref-vantveer2002"/>
+    <w:bookmarkEnd w:id="175"/>
+    <w:bookmarkStart w:id="176" w:name="ref-vantveer2002"/>
     <w:p>
       <w:pPr>
         <w:pStyle w:val="Bibliography"/>
@@ -11550,8 +12325,8 @@
         <w:t xml:space="preserve">415 (6871): 530–36.</w:t>
       </w:r>
     </w:p>
-    <w:bookmarkEnd w:id="174"/>
-    <w:bookmarkStart w:id="175" w:name="ref-vickers2006"/>
+    <w:bookmarkEnd w:id="176"/>
+    <w:bookmarkStart w:id="177" w:name="ref-vickers2006"/>
     <w:p>
       <w:pPr>
         <w:pStyle w:val="Bibliography"/>
@@ -11582,8 +12357,8 @@
         <w:t xml:space="preserve">26 (6): 565–74.</w:t>
       </w:r>
     </w:p>
-    <w:bookmarkEnd w:id="175"/>
-    <w:bookmarkStart w:id="176" w:name="ref-viechtbauer2010"/>
+    <w:bookmarkEnd w:id="177"/>
+    <w:bookmarkStart w:id="178" w:name="ref-viechtbauer2010"/>
     <w:p>
       <w:pPr>
         <w:pStyle w:val="Bibliography"/>
@@ -11626,8 +12401,8 @@
         <w:t xml:space="preserve">36 (3): 1–48.</w:t>
       </w:r>
     </w:p>
-    <w:bookmarkEnd w:id="176"/>
-    <w:bookmarkStart w:id="177" w:name="ref-wolf2022"/>
+    <w:bookmarkEnd w:id="178"/>
+    <w:bookmarkStart w:id="179" w:name="ref-wolf2022"/>
     <w:p>
       <w:pPr>
         <w:pStyle w:val="Bibliography"/>
@@ -11658,8 +12433,8 @@
         <w:t xml:space="preserve">40 (6): 609–23.</w:t>
       </w:r>
     </w:p>
-    <w:bookmarkEnd w:id="177"/>
-    <w:bookmarkStart w:id="178" w:name="ref-zou2005"/>
+    <w:bookmarkEnd w:id="179"/>
+    <w:bookmarkStart w:id="180" w:name="ref-zou2005"/>
     <w:p>
       <w:pPr>
         <w:pStyle w:val="Bibliography"/>
@@ -11690,9 +12465,9 @@
         <w:t xml:space="preserve">67 (2): 301–20.</w:t>
       </w:r>
     </w:p>
-    <w:bookmarkEnd w:id="178"/>
-    <w:bookmarkEnd w:id="179"/>
     <w:bookmarkEnd w:id="180"/>
+    <w:bookmarkEnd w:id="181"/>
+    <w:bookmarkEnd w:id="182"/>
     <w:sectPr>
       <w:footnotePr>
         <w:numRestart w:val="eachSect"/>

</xml_diff>

<commit_message>
Fix references: royston2004→royston2013, wolf2022 pages, add dowsett2013
- Rename royston2004 key to royston2013 (paper published in 2013, not 2004)
- Fix wolf2022 pages: 609-623 → 609-623.e6
- Update \cite{royston2004} → \cite{royston2013} in manuscript
- Regenerate .docx

Co-Authored-By: Claude Opus 4.6 <noreply@anthropic.com>
</commit_message>
<xml_diff>
--- a/submission/CorePAM_manuscript.docx
+++ b/submission/CorePAM_manuscript.docx
@@ -11981,7 +11981,7 @@
       </w:r>
     </w:p>
     <w:bookmarkEnd w:id="167"/>
-    <w:bookmarkStart w:id="168" w:name="ref-royston2004"/>
+    <w:bookmarkStart w:id="168" w:name="ref-royston2013"/>
     <w:p>
       <w:pPr>
         <w:pStyle w:val="Bibliography"/>
@@ -12430,7 +12430,7 @@
         <w:t xml:space="preserve"> </w:t>
       </w:r>
       <w:r>
-        <w:t xml:space="preserve">40 (6): 609–23.</w:t>
+        <w:t xml:space="preserve">40 (6): 609–623.e6.</w:t>
       </w:r>
     </w:p>
     <w:bookmarkEnd w:id="179"/>

</xml_diff>

<commit_message>
Add verified DOIs to all 40 journal references in .bib
Each DOI was looked up via CrossRef API and verified against
the correct paper title, first author, and year.

Co-Authored-By: Claude Opus 4.6 <noreply@anthropic.com>
</commit_message>
<xml_diff>
--- a/submission/CorePAM_manuscript.docx
+++ b/submission/CorePAM_manuscript.docx
@@ -7047,7 +7047,7 @@
       </w:r>
     </w:p>
     <w:bookmarkEnd w:id="92"/>
-    <w:bookmarkStart w:id="182" w:name="additional-files"/>
+    <w:bookmarkStart w:id="222" w:name="additional-files"/>
     <w:p>
       <w:pPr>
         <w:pStyle w:val="Ttulo1"/>
@@ -12528,8 +12528,8 @@
       </w:tr>
     </w:tbl>
     <w:bookmarkEnd w:id="139"/>
-    <w:bookmarkStart w:id="181" w:name="refs"/>
-    <w:bookmarkStart w:id="140" w:name="ref-blanche2013"/>
+    <w:bookmarkStart w:id="221" w:name="refs"/>
+    <w:bookmarkStart w:id="141" w:name="ref-blanche2013"/>
     <w:p>
       <w:pPr>
         <w:pStyle w:val="Bibliografia"/>
@@ -12579,9 +12579,29 @@
         </w:rPr>
         <w:t xml:space="preserve">32 (30): 5381–97.</w:t>
       </w:r>
-    </w:p>
-    <w:bookmarkEnd w:id="140"/>
-    <w:bookmarkStart w:id="141" w:name="ref-botan2026"/>
+      <w:r>
+        <w:rPr>
+          <w:rFonts w:ascii="Times New Roman" w:hAnsi="Times New Roman"/>
+        </w:rPr>
+        <w:t xml:space="preserve"> </w:t>
+      </w:r>
+      <w:hyperlink r:id="rId140">
+        <w:r>
+          <w:rPr>
+            <w:rStyle w:val="Hyperlink"/>
+          </w:rPr>
+          <w:t xml:space="preserve">https://doi.org/10.1002/sim.5958</w:t>
+        </w:r>
+      </w:hyperlink>
+      <w:r>
+        <w:rPr>
+          <w:rFonts w:ascii="Times New Roman" w:hAnsi="Times New Roman"/>
+        </w:rPr>
+        <w:t xml:space="preserve">.</w:t>
+      </w:r>
+    </w:p>
+    <w:bookmarkEnd w:id="141"/>
+    <w:bookmarkStart w:id="142" w:name="ref-botan2026"/>
     <w:p>
       <w:pPr>
         <w:pStyle w:val="Bibliografia"/>
@@ -12662,8 +12682,8 @@
         <w:t xml:space="preserve">.</w:t>
       </w:r>
     </w:p>
-    <w:bookmarkEnd w:id="141"/>
-    <w:bookmarkStart w:id="142" w:name="ref-brueffer2018"/>
+    <w:bookmarkEnd w:id="142"/>
+    <w:bookmarkStart w:id="144" w:name="ref-brueffer2018"/>
     <w:p>
       <w:pPr>
         <w:pStyle w:val="Bibliografia"/>
@@ -12761,9 +12781,29 @@
         </w:rPr>
         <w:t xml:space="preserve">2: 1–18.</w:t>
       </w:r>
-    </w:p>
-    <w:bookmarkEnd w:id="142"/>
-    <w:bookmarkStart w:id="143" w:name="ref-tcga2012"/>
+      <w:r>
+        <w:rPr>
+          <w:rFonts w:ascii="Times New Roman" w:hAnsi="Times New Roman"/>
+        </w:rPr>
+        <w:t xml:space="preserve"> </w:t>
+      </w:r>
+      <w:hyperlink r:id="rId143">
+        <w:r>
+          <w:rPr>
+            <w:rStyle w:val="Hyperlink"/>
+          </w:rPr>
+          <w:t xml:space="preserve">https://doi.org/10.1200/po.17.00135</w:t>
+        </w:r>
+      </w:hyperlink>
+      <w:r>
+        <w:rPr>
+          <w:rFonts w:ascii="Times New Roman" w:hAnsi="Times New Roman"/>
+        </w:rPr>
+        <w:t xml:space="preserve">.</w:t>
+      </w:r>
+    </w:p>
+    <w:bookmarkEnd w:id="144"/>
+    <w:bookmarkStart w:id="146" w:name="ref-tcga2012"/>
     <w:p>
       <w:pPr>
         <w:pStyle w:val="Bibliografia"/>
@@ -12813,9 +12853,29 @@
         </w:rPr>
         <w:t xml:space="preserve">490 (7418): 61–70.</w:t>
       </w:r>
-    </w:p>
-    <w:bookmarkEnd w:id="143"/>
-    <w:bookmarkStart w:id="144" w:name="ref-cardoso2016"/>
+      <w:r>
+        <w:rPr>
+          <w:rFonts w:ascii="Times New Roman" w:hAnsi="Times New Roman"/>
+        </w:rPr>
+        <w:t xml:space="preserve"> </w:t>
+      </w:r>
+      <w:hyperlink r:id="rId145">
+        <w:r>
+          <w:rPr>
+            <w:rStyle w:val="Hyperlink"/>
+          </w:rPr>
+          <w:t xml:space="preserve">https://doi.org/10.1038/nature11412</w:t>
+        </w:r>
+      </w:hyperlink>
+      <w:r>
+        <w:rPr>
+          <w:rFonts w:ascii="Times New Roman" w:hAnsi="Times New Roman"/>
+        </w:rPr>
+        <w:t xml:space="preserve">.</w:t>
+      </w:r>
+    </w:p>
+    <w:bookmarkEnd w:id="146"/>
+    <w:bookmarkStart w:id="148" w:name="ref-cardoso2016"/>
     <w:p>
       <w:pPr>
         <w:pStyle w:val="Bibliografia"/>
@@ -12865,9 +12925,29 @@
         </w:rPr>
         <w:t xml:space="preserve">375 (8): 717–29.</w:t>
       </w:r>
-    </w:p>
-    <w:bookmarkEnd w:id="144"/>
-    <w:bookmarkStart w:id="145" w:name="ref-curtis2012"/>
+      <w:r>
+        <w:rPr>
+          <w:rFonts w:ascii="Times New Roman" w:hAnsi="Times New Roman"/>
+        </w:rPr>
+        <w:t xml:space="preserve"> </w:t>
+      </w:r>
+      <w:hyperlink r:id="rId147">
+        <w:r>
+          <w:rPr>
+            <w:rStyle w:val="Hyperlink"/>
+          </w:rPr>
+          <w:t xml:space="preserve">https://doi.org/10.1056/NEJMoa1602253</w:t>
+        </w:r>
+      </w:hyperlink>
+      <w:r>
+        <w:rPr>
+          <w:rFonts w:ascii="Times New Roman" w:hAnsi="Times New Roman"/>
+        </w:rPr>
+        <w:t xml:space="preserve">.</w:t>
+      </w:r>
+    </w:p>
+    <w:bookmarkEnd w:id="148"/>
+    <w:bookmarkStart w:id="150" w:name="ref-curtis2012"/>
     <w:p>
       <w:pPr>
         <w:pStyle w:val="Bibliografia"/>
@@ -12917,9 +12997,29 @@
         </w:rPr>
         <w:t xml:space="preserve">486 (7403): 346–52.</w:t>
       </w:r>
-    </w:p>
-    <w:bookmarkEnd w:id="145"/>
-    <w:bookmarkStart w:id="146" w:name="ref-dersimonian1986"/>
+      <w:r>
+        <w:rPr>
+          <w:rFonts w:ascii="Times New Roman" w:hAnsi="Times New Roman"/>
+        </w:rPr>
+        <w:t xml:space="preserve"> </w:t>
+      </w:r>
+      <w:hyperlink r:id="rId149">
+        <w:r>
+          <w:rPr>
+            <w:rStyle w:val="Hyperlink"/>
+          </w:rPr>
+          <w:t xml:space="preserve">https://doi.org/10.1038/nature10983</w:t>
+        </w:r>
+      </w:hyperlink>
+      <w:r>
+        <w:rPr>
+          <w:rFonts w:ascii="Times New Roman" w:hAnsi="Times New Roman"/>
+        </w:rPr>
+        <w:t xml:space="preserve">.</w:t>
+      </w:r>
+    </w:p>
+    <w:bookmarkEnd w:id="150"/>
+    <w:bookmarkStart w:id="152" w:name="ref-dersimonian1986"/>
     <w:p>
       <w:pPr>
         <w:pStyle w:val="Bibliografia"/>
@@ -12969,9 +13069,29 @@
         </w:rPr>
         <w:t xml:space="preserve">7 (3): 177–88.</w:t>
       </w:r>
-    </w:p>
-    <w:bookmarkEnd w:id="146"/>
-    <w:bookmarkStart w:id="147" w:name="ref-dowsett2013"/>
+      <w:r>
+        <w:rPr>
+          <w:rFonts w:ascii="Times New Roman" w:hAnsi="Times New Roman"/>
+        </w:rPr>
+        <w:t xml:space="preserve"> </w:t>
+      </w:r>
+      <w:hyperlink r:id="rId151">
+        <w:r>
+          <w:rPr>
+            <w:rStyle w:val="Hyperlink"/>
+          </w:rPr>
+          <w:t xml:space="preserve">https://doi.org/10.1016/0197-2456(86)90046-2</w:t>
+        </w:r>
+      </w:hyperlink>
+      <w:r>
+        <w:rPr>
+          <w:rFonts w:ascii="Times New Roman" w:hAnsi="Times New Roman"/>
+        </w:rPr>
+        <w:t xml:space="preserve">.</w:t>
+      </w:r>
+    </w:p>
+    <w:bookmarkEnd w:id="152"/>
+    <w:bookmarkStart w:id="154" w:name="ref-dowsett2013"/>
     <w:p>
       <w:pPr>
         <w:pStyle w:val="Bibliografia"/>
@@ -13111,9 +13231,29 @@
         </w:rPr>
         <w:t xml:space="preserve">31 (22): 2783–90.</w:t>
       </w:r>
-    </w:p>
-    <w:bookmarkEnd w:id="147"/>
-    <w:bookmarkStart w:id="148" w:name="ref-esserman2012"/>
+      <w:r>
+        <w:rPr>
+          <w:rFonts w:ascii="Times New Roman" w:hAnsi="Times New Roman"/>
+        </w:rPr>
+        <w:t xml:space="preserve"> </w:t>
+      </w:r>
+      <w:hyperlink r:id="rId153">
+        <w:r>
+          <w:rPr>
+            <w:rStyle w:val="Hyperlink"/>
+          </w:rPr>
+          <w:t xml:space="preserve">https://doi.org/10.1200/jco.2012.46.1558</w:t>
+        </w:r>
+      </w:hyperlink>
+      <w:r>
+        <w:rPr>
+          <w:rFonts w:ascii="Times New Roman" w:hAnsi="Times New Roman"/>
+        </w:rPr>
+        <w:t xml:space="preserve">.</w:t>
+      </w:r>
+    </w:p>
+    <w:bookmarkEnd w:id="154"/>
+    <w:bookmarkStart w:id="156" w:name="ref-esserman2012"/>
     <w:p>
       <w:pPr>
         <w:pStyle w:val="Bibliografia"/>
@@ -13181,9 +13321,29 @@
         </w:rPr>
         <w:t xml:space="preserve">132 (3): 1049–62.</w:t>
       </w:r>
-    </w:p>
-    <w:bookmarkEnd w:id="148"/>
-    <w:bookmarkStart w:id="149" w:name="ref-fine1999"/>
+      <w:r>
+        <w:rPr>
+          <w:rFonts w:ascii="Times New Roman" w:hAnsi="Times New Roman"/>
+        </w:rPr>
+        <w:t xml:space="preserve"> </w:t>
+      </w:r>
+      <w:hyperlink r:id="rId155">
+        <w:r>
+          <w:rPr>
+            <w:rStyle w:val="Hyperlink"/>
+          </w:rPr>
+          <w:t xml:space="preserve">https://doi.org/10.1007/s10549-011-1895-2</w:t>
+        </w:r>
+      </w:hyperlink>
+      <w:r>
+        <w:rPr>
+          <w:rFonts w:ascii="Times New Roman" w:hAnsi="Times New Roman"/>
+        </w:rPr>
+        <w:t xml:space="preserve">.</w:t>
+      </w:r>
+    </w:p>
+    <w:bookmarkEnd w:id="156"/>
+    <w:bookmarkStart w:id="158" w:name="ref-fine1999"/>
     <w:p>
       <w:pPr>
         <w:pStyle w:val="Bibliografia"/>
@@ -13233,9 +13393,29 @@
         </w:rPr>
         <w:t xml:space="preserve">94 (446): 496–509.</w:t>
       </w:r>
-    </w:p>
-    <w:bookmarkEnd w:id="149"/>
-    <w:bookmarkStart w:id="150" w:name="ref-friedman2010"/>
+      <w:r>
+        <w:rPr>
+          <w:rFonts w:ascii="Times New Roman" w:hAnsi="Times New Roman"/>
+        </w:rPr>
+        <w:t xml:space="preserve"> </w:t>
+      </w:r>
+      <w:hyperlink r:id="rId157">
+        <w:r>
+          <w:rPr>
+            <w:rStyle w:val="Hyperlink"/>
+          </w:rPr>
+          <w:t xml:space="preserve">https://doi.org/10.1080/01621459.1999.10474144</w:t>
+        </w:r>
+      </w:hyperlink>
+      <w:r>
+        <w:rPr>
+          <w:rFonts w:ascii="Times New Roman" w:hAnsi="Times New Roman"/>
+        </w:rPr>
+        <w:t xml:space="preserve">.</w:t>
+      </w:r>
+    </w:p>
+    <w:bookmarkEnd w:id="158"/>
+    <w:bookmarkStart w:id="160" w:name="ref-friedman2010"/>
     <w:p>
       <w:pPr>
         <w:pStyle w:val="Bibliografia"/>
@@ -13285,9 +13465,29 @@
         </w:rPr>
         <w:t xml:space="preserve">33 (1): 1–22.</w:t>
       </w:r>
-    </w:p>
-    <w:bookmarkEnd w:id="150"/>
-    <w:bookmarkStart w:id="151" w:name="ref-gendoo2016"/>
+      <w:r>
+        <w:rPr>
+          <w:rFonts w:ascii="Times New Roman" w:hAnsi="Times New Roman"/>
+        </w:rPr>
+        <w:t xml:space="preserve"> </w:t>
+      </w:r>
+      <w:hyperlink r:id="rId159">
+        <w:r>
+          <w:rPr>
+            <w:rStyle w:val="Hyperlink"/>
+          </w:rPr>
+          <w:t xml:space="preserve">https://doi.org/10.18637/jss.v033.i01</w:t>
+        </w:r>
+      </w:hyperlink>
+      <w:r>
+        <w:rPr>
+          <w:rFonts w:ascii="Times New Roman" w:hAnsi="Times New Roman"/>
+        </w:rPr>
+        <w:t xml:space="preserve">.</w:t>
+      </w:r>
+    </w:p>
+    <w:bookmarkEnd w:id="160"/>
+    <w:bookmarkStart w:id="162" w:name="ref-gendoo2016"/>
     <w:p>
       <w:pPr>
         <w:pStyle w:val="Bibliografia"/>
@@ -13361,9 +13561,29 @@
         </w:rPr>
         <w:t xml:space="preserve">32 (7): 1097–99.</w:t>
       </w:r>
-    </w:p>
-    <w:bookmarkEnd w:id="151"/>
-    <w:bookmarkStart w:id="152" w:name="ref-grambsch1994"/>
+      <w:r>
+        <w:rPr>
+          <w:rFonts w:ascii="Times New Roman" w:hAnsi="Times New Roman"/>
+        </w:rPr>
+        <w:t xml:space="preserve"> </w:t>
+      </w:r>
+      <w:hyperlink r:id="rId161">
+        <w:r>
+          <w:rPr>
+            <w:rStyle w:val="Hyperlink"/>
+          </w:rPr>
+          <w:t xml:space="preserve">https://doi.org/10.1093/bioinformatics/btv693</w:t>
+        </w:r>
+      </w:hyperlink>
+      <w:r>
+        <w:rPr>
+          <w:rFonts w:ascii="Times New Roman" w:hAnsi="Times New Roman"/>
+        </w:rPr>
+        <w:t xml:space="preserve">.</w:t>
+      </w:r>
+    </w:p>
+    <w:bookmarkEnd w:id="162"/>
+    <w:bookmarkStart w:id="164" w:name="ref-grambsch1994"/>
     <w:p>
       <w:pPr>
         <w:pStyle w:val="Bibliografia"/>
@@ -13413,9 +13633,29 @@
         </w:rPr>
         <w:t xml:space="preserve">81 (3): 515–26.</w:t>
       </w:r>
-    </w:p>
-    <w:bookmarkEnd w:id="152"/>
-    <w:bookmarkStart w:id="153" w:name="ref-harrell1982"/>
+      <w:r>
+        <w:rPr>
+          <w:rFonts w:ascii="Times New Roman" w:hAnsi="Times New Roman"/>
+        </w:rPr>
+        <w:t xml:space="preserve"> </w:t>
+      </w:r>
+      <w:hyperlink r:id="rId163">
+        <w:r>
+          <w:rPr>
+            <w:rStyle w:val="Hyperlink"/>
+          </w:rPr>
+          <w:t xml:space="preserve">https://doi.org/10.1093/biomet/81.3.515</w:t>
+        </w:r>
+      </w:hyperlink>
+      <w:r>
+        <w:rPr>
+          <w:rFonts w:ascii="Times New Roman" w:hAnsi="Times New Roman"/>
+        </w:rPr>
+        <w:t xml:space="preserve">.</w:t>
+      </w:r>
+    </w:p>
+    <w:bookmarkEnd w:id="164"/>
+    <w:bookmarkStart w:id="166" w:name="ref-harrell1982"/>
     <w:p>
       <w:pPr>
         <w:pStyle w:val="Bibliografia"/>
@@ -13465,9 +13705,29 @@
         </w:rPr>
         <w:t xml:space="preserve">247 (18): 2543–46.</w:t>
       </w:r>
-    </w:p>
-    <w:bookmarkEnd w:id="153"/>
-    <w:bookmarkStart w:id="154" w:name="ref-hartung2001"/>
+      <w:r>
+        <w:rPr>
+          <w:rFonts w:ascii="Times New Roman" w:hAnsi="Times New Roman"/>
+        </w:rPr>
+        <w:t xml:space="preserve"> </w:t>
+      </w:r>
+      <w:hyperlink r:id="rId165">
+        <w:r>
+          <w:rPr>
+            <w:rStyle w:val="Hyperlink"/>
+          </w:rPr>
+          <w:t xml:space="preserve">https://doi.org/10.1001/jama.1982.03320430047030</w:t>
+        </w:r>
+      </w:hyperlink>
+      <w:r>
+        <w:rPr>
+          <w:rFonts w:ascii="Times New Roman" w:hAnsi="Times New Roman"/>
+        </w:rPr>
+        <w:t xml:space="preserve">.</w:t>
+      </w:r>
+    </w:p>
+    <w:bookmarkEnd w:id="166"/>
+    <w:bookmarkStart w:id="168" w:name="ref-hartung2001"/>
     <w:p>
       <w:pPr>
         <w:pStyle w:val="Bibliografia"/>
@@ -13517,9 +13777,29 @@
         </w:rPr>
         <w:t xml:space="preserve">20 (24): 3875–89.</w:t>
       </w:r>
-    </w:p>
-    <w:bookmarkEnd w:id="154"/>
-    <w:bookmarkStart w:id="155" w:name="ref-hatzis2011"/>
+      <w:r>
+        <w:rPr>
+          <w:rFonts w:ascii="Times New Roman" w:hAnsi="Times New Roman"/>
+        </w:rPr>
+        <w:t xml:space="preserve"> </w:t>
+      </w:r>
+      <w:hyperlink r:id="rId167">
+        <w:r>
+          <w:rPr>
+            <w:rStyle w:val="Hyperlink"/>
+          </w:rPr>
+          <w:t xml:space="preserve">https://doi.org/10.1002/sim.1009</w:t>
+        </w:r>
+      </w:hyperlink>
+      <w:r>
+        <w:rPr>
+          <w:rFonts w:ascii="Times New Roman" w:hAnsi="Times New Roman"/>
+        </w:rPr>
+        <w:t xml:space="preserve">.</w:t>
+      </w:r>
+    </w:p>
+    <w:bookmarkEnd w:id="168"/>
+    <w:bookmarkStart w:id="170" w:name="ref-hatzis2011"/>
     <w:p>
       <w:pPr>
         <w:pStyle w:val="Bibliografia"/>
@@ -13569,9 +13849,29 @@
         </w:rPr>
         <w:t xml:space="preserve">305 (18): 1873–81.</w:t>
       </w:r>
-    </w:p>
-    <w:bookmarkEnd w:id="155"/>
-    <w:bookmarkStart w:id="156" w:name="ref-higgins2003"/>
+      <w:r>
+        <w:rPr>
+          <w:rFonts w:ascii="Times New Roman" w:hAnsi="Times New Roman"/>
+        </w:rPr>
+        <w:t xml:space="preserve"> </w:t>
+      </w:r>
+      <w:hyperlink r:id="rId169">
+        <w:r>
+          <w:rPr>
+            <w:rStyle w:val="Hyperlink"/>
+          </w:rPr>
+          <w:t xml:space="preserve">https://doi.org/10.1001/jama.2011.593</w:t>
+        </w:r>
+      </w:hyperlink>
+      <w:r>
+        <w:rPr>
+          <w:rFonts w:ascii="Times New Roman" w:hAnsi="Times New Roman"/>
+        </w:rPr>
+        <w:t xml:space="preserve">.</w:t>
+      </w:r>
+    </w:p>
+    <w:bookmarkEnd w:id="170"/>
+    <w:bookmarkStart w:id="172" w:name="ref-higgins2003"/>
     <w:p>
       <w:pPr>
         <w:pStyle w:val="Bibliografia"/>
@@ -13621,9 +13921,29 @@
         </w:rPr>
         <w:t xml:space="preserve">327 (7414): 557–60.</w:t>
       </w:r>
-    </w:p>
-    <w:bookmarkEnd w:id="156"/>
-    <w:bookmarkStart w:id="157" w:name="ref-kao2011"/>
+      <w:r>
+        <w:rPr>
+          <w:rFonts w:ascii="Times New Roman" w:hAnsi="Times New Roman"/>
+        </w:rPr>
+        <w:t xml:space="preserve"> </w:t>
+      </w:r>
+      <w:hyperlink r:id="rId171">
+        <w:r>
+          <w:rPr>
+            <w:rStyle w:val="Hyperlink"/>
+          </w:rPr>
+          <w:t xml:space="preserve">https://doi.org/10.1136/bmj.327.7414.557</w:t>
+        </w:r>
+      </w:hyperlink>
+      <w:r>
+        <w:rPr>
+          <w:rFonts w:ascii="Times New Roman" w:hAnsi="Times New Roman"/>
+        </w:rPr>
+        <w:t xml:space="preserve">.</w:t>
+      </w:r>
+    </w:p>
+    <w:bookmarkEnd w:id="172"/>
+    <w:bookmarkStart w:id="174" w:name="ref-kao2011"/>
     <w:p>
       <w:pPr>
         <w:pStyle w:val="Bibliografia"/>
@@ -13673,9 +13993,29 @@
         </w:rPr>
         <w:t xml:space="preserve">11: 143.</w:t>
       </w:r>
-    </w:p>
-    <w:bookmarkEnd w:id="157"/>
-    <w:bookmarkStart w:id="158" w:name="ref-maqc2010"/>
+      <w:r>
+        <w:rPr>
+          <w:rFonts w:ascii="Times New Roman" w:hAnsi="Times New Roman"/>
+        </w:rPr>
+        <w:t xml:space="preserve"> </w:t>
+      </w:r>
+      <w:hyperlink r:id="rId173">
+        <w:r>
+          <w:rPr>
+            <w:rStyle w:val="Hyperlink"/>
+          </w:rPr>
+          <w:t xml:space="preserve">https://doi.org/10.1186/1471-2407-11-143</w:t>
+        </w:r>
+      </w:hyperlink>
+      <w:r>
+        <w:rPr>
+          <w:rFonts w:ascii="Times New Roman" w:hAnsi="Times New Roman"/>
+        </w:rPr>
+        <w:t xml:space="preserve">.</w:t>
+      </w:r>
+    </w:p>
+    <w:bookmarkEnd w:id="174"/>
+    <w:bookmarkStart w:id="176" w:name="ref-maqc2010"/>
     <w:p>
       <w:pPr>
         <w:pStyle w:val="Bibliografia"/>
@@ -13749,9 +14089,29 @@
         </w:rPr>
         <w:t xml:space="preserve">28 (8): 827–38.</w:t>
       </w:r>
-    </w:p>
-    <w:bookmarkEnd w:id="158"/>
-    <w:bookmarkStart w:id="159" w:name="ref-miyake2012"/>
+      <w:r>
+        <w:rPr>
+          <w:rFonts w:ascii="Times New Roman" w:hAnsi="Times New Roman"/>
+        </w:rPr>
+        <w:t xml:space="preserve"> </w:t>
+      </w:r>
+      <w:hyperlink r:id="rId175">
+        <w:r>
+          <w:rPr>
+            <w:rStyle w:val="Hyperlink"/>
+          </w:rPr>
+          <w:t xml:space="preserve">https://doi.org/10.1038/nbt.1665</w:t>
+        </w:r>
+      </w:hyperlink>
+      <w:r>
+        <w:rPr>
+          <w:rFonts w:ascii="Times New Roman" w:hAnsi="Times New Roman"/>
+        </w:rPr>
+        <w:t xml:space="preserve">.</w:t>
+      </w:r>
+    </w:p>
+    <w:bookmarkEnd w:id="176"/>
+    <w:bookmarkStart w:id="178" w:name="ref-miyake2012"/>
     <w:p>
       <w:pPr>
         <w:pStyle w:val="Bibliografia"/>
@@ -13837,9 +14197,29 @@
         </w:rPr>
         <w:t xml:space="preserve">103 (5): 913–20.</w:t>
       </w:r>
-    </w:p>
-    <w:bookmarkEnd w:id="159"/>
-    <w:bookmarkStart w:id="160" w:name="ref-moons2015"/>
+      <w:r>
+        <w:rPr>
+          <w:rFonts w:ascii="Times New Roman" w:hAnsi="Times New Roman"/>
+        </w:rPr>
+        <w:t xml:space="preserve"> </w:t>
+      </w:r>
+      <w:hyperlink r:id="rId177">
+        <w:r>
+          <w:rPr>
+            <w:rStyle w:val="Hyperlink"/>
+          </w:rPr>
+          <w:t xml:space="preserve">https://doi.org/10.1111/j.1349-7006.2012.02231.x</w:t>
+        </w:r>
+      </w:hyperlink>
+      <w:r>
+        <w:rPr>
+          <w:rFonts w:ascii="Times New Roman" w:hAnsi="Times New Roman"/>
+        </w:rPr>
+        <w:t xml:space="preserve">.</w:t>
+      </w:r>
+    </w:p>
+    <w:bookmarkEnd w:id="178"/>
+    <w:bookmarkStart w:id="180" w:name="ref-moons2015"/>
     <w:p>
       <w:pPr>
         <w:pStyle w:val="Bibliografia"/>
@@ -13973,9 +14353,29 @@
         </w:rPr>
         <w:t xml:space="preserve">162 (1): W1–73.</w:t>
       </w:r>
-    </w:p>
-    <w:bookmarkEnd w:id="160"/>
-    <w:bookmarkStart w:id="161" w:name="ref-nielsen2014"/>
+      <w:r>
+        <w:rPr>
+          <w:rFonts w:ascii="Times New Roman" w:hAnsi="Times New Roman"/>
+        </w:rPr>
+        <w:t xml:space="preserve"> </w:t>
+      </w:r>
+      <w:hyperlink r:id="rId179">
+        <w:r>
+          <w:rPr>
+            <w:rStyle w:val="Hyperlink"/>
+          </w:rPr>
+          <w:t xml:space="preserve">https://doi.org/10.7326/M14-0698</w:t>
+        </w:r>
+      </w:hyperlink>
+      <w:r>
+        <w:rPr>
+          <w:rFonts w:ascii="Times New Roman" w:hAnsi="Times New Roman"/>
+        </w:rPr>
+        <w:t xml:space="preserve">.</w:t>
+      </w:r>
+    </w:p>
+    <w:bookmarkEnd w:id="180"/>
+    <w:bookmarkStart w:id="182" w:name="ref-nielsen2014"/>
     <w:p>
       <w:pPr>
         <w:pStyle w:val="Bibliografia"/>
@@ -14091,9 +14491,29 @@
         </w:rPr>
         <w:t xml:space="preserve">14: 177.</w:t>
       </w:r>
-    </w:p>
-    <w:bookmarkEnd w:id="161"/>
-    <w:bookmarkStart w:id="162" w:name="ref-paik2004"/>
+      <w:r>
+        <w:rPr>
+          <w:rFonts w:ascii="Times New Roman" w:hAnsi="Times New Roman"/>
+        </w:rPr>
+        <w:t xml:space="preserve"> </w:t>
+      </w:r>
+      <w:hyperlink r:id="rId181">
+        <w:r>
+          <w:rPr>
+            <w:rStyle w:val="Hyperlink"/>
+          </w:rPr>
+          <w:t xml:space="preserve">https://doi.org/10.1186/1471-2407-14-177</w:t>
+        </w:r>
+      </w:hyperlink>
+      <w:r>
+        <w:rPr>
+          <w:rFonts w:ascii="Times New Roman" w:hAnsi="Times New Roman"/>
+        </w:rPr>
+        <w:t xml:space="preserve">.</w:t>
+      </w:r>
+    </w:p>
+    <w:bookmarkEnd w:id="182"/>
+    <w:bookmarkStart w:id="184" w:name="ref-paik2004"/>
     <w:p>
       <w:pPr>
         <w:pStyle w:val="Bibliografia"/>
@@ -14143,9 +14563,29 @@
         </w:rPr>
         <w:t xml:space="preserve">351 (27): 2817–26.</w:t>
       </w:r>
-    </w:p>
-    <w:bookmarkEnd w:id="162"/>
-    <w:bookmarkStart w:id="163" w:name="ref-parker2009"/>
+      <w:r>
+        <w:rPr>
+          <w:rFonts w:ascii="Times New Roman" w:hAnsi="Times New Roman"/>
+        </w:rPr>
+        <w:t xml:space="preserve"> </w:t>
+      </w:r>
+      <w:hyperlink r:id="rId183">
+        <w:r>
+          <w:rPr>
+            <w:rStyle w:val="Hyperlink"/>
+          </w:rPr>
+          <w:t xml:space="preserve">https://doi.org/10.1056/nejmoa041588</w:t>
+        </w:r>
+      </w:hyperlink>
+      <w:r>
+        <w:rPr>
+          <w:rFonts w:ascii="Times New Roman" w:hAnsi="Times New Roman"/>
+        </w:rPr>
+        <w:t xml:space="preserve">.</w:t>
+      </w:r>
+    </w:p>
+    <w:bookmarkEnd w:id="184"/>
+    <w:bookmarkStart w:id="186" w:name="ref-parker2009"/>
     <w:p>
       <w:pPr>
         <w:pStyle w:val="Bibliografia"/>
@@ -14195,9 +14635,29 @@
         </w:rPr>
         <w:t xml:space="preserve">27 (8): 1160–67.</w:t>
       </w:r>
-    </w:p>
-    <w:bookmarkEnd w:id="163"/>
-    <w:bookmarkStart w:id="164" w:name="ref-pawitan2005"/>
+      <w:r>
+        <w:rPr>
+          <w:rFonts w:ascii="Times New Roman" w:hAnsi="Times New Roman"/>
+        </w:rPr>
+        <w:t xml:space="preserve"> </w:t>
+      </w:r>
+      <w:hyperlink r:id="rId185">
+        <w:r>
+          <w:rPr>
+            <w:rStyle w:val="Hyperlink"/>
+          </w:rPr>
+          <w:t xml:space="preserve">https://doi.org/10.1200/jco.2008.18.1370</w:t>
+        </w:r>
+      </w:hyperlink>
+      <w:r>
+        <w:rPr>
+          <w:rFonts w:ascii="Times New Roman" w:hAnsi="Times New Roman"/>
+        </w:rPr>
+        <w:t xml:space="preserve">.</w:t>
+      </w:r>
+    </w:p>
+    <w:bookmarkEnd w:id="186"/>
+    <w:bookmarkStart w:id="188" w:name="ref-pawitan2005"/>
     <w:p>
       <w:pPr>
         <w:pStyle w:val="Bibliografia"/>
@@ -14247,9 +14707,29 @@
         </w:rPr>
         <w:t xml:space="preserve">7 (6): R953–64.</w:t>
       </w:r>
-    </w:p>
-    <w:bookmarkEnd w:id="164"/>
-    <w:bookmarkStart w:id="165" w:name="ref-perou2000"/>
+      <w:r>
+        <w:rPr>
+          <w:rFonts w:ascii="Times New Roman" w:hAnsi="Times New Roman"/>
+        </w:rPr>
+        <w:t xml:space="preserve"> </w:t>
+      </w:r>
+      <w:hyperlink r:id="rId187">
+        <w:r>
+          <w:rPr>
+            <w:rStyle w:val="Hyperlink"/>
+          </w:rPr>
+          <w:t xml:space="preserve">https://doi.org/10.1186/bcr1325</w:t>
+        </w:r>
+      </w:hyperlink>
+      <w:r>
+        <w:rPr>
+          <w:rFonts w:ascii="Times New Roman" w:hAnsi="Times New Roman"/>
+        </w:rPr>
+        <w:t xml:space="preserve">.</w:t>
+      </w:r>
+    </w:p>
+    <w:bookmarkEnd w:id="188"/>
+    <w:bookmarkStart w:id="190" w:name="ref-perou2000"/>
     <w:p>
       <w:pPr>
         <w:pStyle w:val="Bibliografia"/>
@@ -14299,9 +14779,29 @@
         </w:rPr>
         <w:t xml:space="preserve">406 (6797): 747–52.</w:t>
       </w:r>
-    </w:p>
-    <w:bookmarkEnd w:id="165"/>
-    <w:bookmarkStart w:id="166" w:name="ref-prat2015"/>
+      <w:r>
+        <w:rPr>
+          <w:rFonts w:ascii="Times New Roman" w:hAnsi="Times New Roman"/>
+        </w:rPr>
+        <w:t xml:space="preserve"> </w:t>
+      </w:r>
+      <w:hyperlink r:id="rId189">
+        <w:r>
+          <w:rPr>
+            <w:rStyle w:val="Hyperlink"/>
+          </w:rPr>
+          <w:t xml:space="preserve">https://doi.org/10.1038/35021093</w:t>
+        </w:r>
+      </w:hyperlink>
+      <w:r>
+        <w:rPr>
+          <w:rFonts w:ascii="Times New Roman" w:hAnsi="Times New Roman"/>
+        </w:rPr>
+        <w:t xml:space="preserve">.</w:t>
+      </w:r>
+    </w:p>
+    <w:bookmarkEnd w:id="190"/>
+    <w:bookmarkStart w:id="192" w:name="ref-prat2015"/>
     <w:p>
       <w:pPr>
         <w:pStyle w:val="Bibliografia"/>
@@ -14351,9 +14851,29 @@
         </w:rPr>
         <w:t xml:space="preserve">13: 303.</w:t>
       </w:r>
-    </w:p>
-    <w:bookmarkEnd w:id="166"/>
-    <w:bookmarkStart w:id="167" w:name="ref-robinson2010"/>
+      <w:r>
+        <w:rPr>
+          <w:rFonts w:ascii="Times New Roman" w:hAnsi="Times New Roman"/>
+        </w:rPr>
+        <w:t xml:space="preserve"> </w:t>
+      </w:r>
+      <w:hyperlink r:id="rId191">
+        <w:r>
+          <w:rPr>
+            <w:rStyle w:val="Hyperlink"/>
+          </w:rPr>
+          <w:t xml:space="preserve">https://doi.org/10.1186/s12916-015-0540-z</w:t>
+        </w:r>
+      </w:hyperlink>
+      <w:r>
+        <w:rPr>
+          <w:rFonts w:ascii="Times New Roman" w:hAnsi="Times New Roman"/>
+        </w:rPr>
+        <w:t xml:space="preserve">.</w:t>
+      </w:r>
+    </w:p>
+    <w:bookmarkEnd w:id="192"/>
+    <w:bookmarkStart w:id="194" w:name="ref-robinson2010"/>
     <w:p>
       <w:pPr>
         <w:pStyle w:val="Bibliografia"/>
@@ -14433,9 +14953,29 @@
         </w:rPr>
         <w:t xml:space="preserve">26 (1): 139–40.</w:t>
       </w:r>
-    </w:p>
-    <w:bookmarkEnd w:id="167"/>
-    <w:bookmarkStart w:id="168" w:name="ref-royston2013"/>
+      <w:r>
+        <w:rPr>
+          <w:rFonts w:ascii="Times New Roman" w:hAnsi="Times New Roman"/>
+        </w:rPr>
+        <w:t xml:space="preserve"> </w:t>
+      </w:r>
+      <w:hyperlink r:id="rId193">
+        <w:r>
+          <w:rPr>
+            <w:rStyle w:val="Hyperlink"/>
+          </w:rPr>
+          <w:t xml:space="preserve">https://doi.org/10.1093/bioinformatics/btp616</w:t>
+        </w:r>
+      </w:hyperlink>
+      <w:r>
+        <w:rPr>
+          <w:rFonts w:ascii="Times New Roman" w:hAnsi="Times New Roman"/>
+        </w:rPr>
+        <w:t xml:space="preserve">.</w:t>
+      </w:r>
+    </w:p>
+    <w:bookmarkEnd w:id="194"/>
+    <w:bookmarkStart w:id="196" w:name="ref-royston2013"/>
     <w:p>
       <w:pPr>
         <w:pStyle w:val="Bibliografia"/>
@@ -14503,9 +15043,29 @@
         </w:rPr>
         <w:t xml:space="preserve">13: 33.</w:t>
       </w:r>
-    </w:p>
-    <w:bookmarkEnd w:id="168"/>
-    <w:bookmarkStart w:id="169" w:name="ref-saal2015"/>
+      <w:r>
+        <w:rPr>
+          <w:rFonts w:ascii="Times New Roman" w:hAnsi="Times New Roman"/>
+        </w:rPr>
+        <w:t xml:space="preserve"> </w:t>
+      </w:r>
+      <w:hyperlink r:id="rId195">
+        <w:r>
+          <w:rPr>
+            <w:rStyle w:val="Hyperlink"/>
+          </w:rPr>
+          <w:t xml:space="preserve">https://doi.org/10.1186/1471-2288-13-33</w:t>
+        </w:r>
+      </w:hyperlink>
+      <w:r>
+        <w:rPr>
+          <w:rFonts w:ascii="Times New Roman" w:hAnsi="Times New Roman"/>
+        </w:rPr>
+        <w:t xml:space="preserve">.</w:t>
+      </w:r>
+    </w:p>
+    <w:bookmarkEnd w:id="196"/>
+    <w:bookmarkStart w:id="198" w:name="ref-saal2015"/>
     <w:p>
       <w:pPr>
         <w:pStyle w:val="Bibliografia"/>
@@ -14573,9 +15133,29 @@
         </w:rPr>
         <w:t xml:space="preserve">7: 20.</w:t>
       </w:r>
-    </w:p>
-    <w:bookmarkEnd w:id="169"/>
-    <w:bookmarkStart w:id="170" w:name="ref-simon2011"/>
+      <w:r>
+        <w:rPr>
+          <w:rFonts w:ascii="Times New Roman" w:hAnsi="Times New Roman"/>
+        </w:rPr>
+        <w:t xml:space="preserve"> </w:t>
+      </w:r>
+      <w:hyperlink r:id="rId197">
+        <w:r>
+          <w:rPr>
+            <w:rStyle w:val="Hyperlink"/>
+          </w:rPr>
+          <w:t xml:space="preserve">https://doi.org/10.1186/s13073-015-0131-9</w:t>
+        </w:r>
+      </w:hyperlink>
+      <w:r>
+        <w:rPr>
+          <w:rFonts w:ascii="Times New Roman" w:hAnsi="Times New Roman"/>
+        </w:rPr>
+        <w:t xml:space="preserve">.</w:t>
+      </w:r>
+    </w:p>
+    <w:bookmarkEnd w:id="198"/>
+    <w:bookmarkStart w:id="200" w:name="ref-simon2011"/>
     <w:p>
       <w:pPr>
         <w:pStyle w:val="Bibliografia"/>
@@ -14643,9 +15223,29 @@
         </w:rPr>
         <w:t xml:space="preserve">39 (5): 1–13.</w:t>
       </w:r>
-    </w:p>
-    <w:bookmarkEnd w:id="170"/>
-    <w:bookmarkStart w:id="171" w:name="ref-sorlie2001"/>
+      <w:r>
+        <w:rPr>
+          <w:rFonts w:ascii="Times New Roman" w:hAnsi="Times New Roman"/>
+        </w:rPr>
+        <w:t xml:space="preserve"> </w:t>
+      </w:r>
+      <w:hyperlink r:id="rId199">
+        <w:r>
+          <w:rPr>
+            <w:rStyle w:val="Hyperlink"/>
+          </w:rPr>
+          <w:t xml:space="preserve">https://doi.org/10.18637/jss.v039.i05</w:t>
+        </w:r>
+      </w:hyperlink>
+      <w:r>
+        <w:rPr>
+          <w:rFonts w:ascii="Times New Roman" w:hAnsi="Times New Roman"/>
+        </w:rPr>
+        <w:t xml:space="preserve">.</w:t>
+      </w:r>
+    </w:p>
+    <w:bookmarkEnd w:id="200"/>
+    <w:bookmarkStart w:id="202" w:name="ref-sorlie2001"/>
     <w:p>
       <w:pPr>
         <w:pStyle w:val="Bibliografia"/>
@@ -14695,9 +15295,29 @@
         </w:rPr>
         <w:t xml:space="preserve">98 (19): 10869–74.</w:t>
       </w:r>
-    </w:p>
-    <w:bookmarkEnd w:id="171"/>
-    <w:bookmarkStart w:id="172" w:name="ref-sparano2018"/>
+      <w:r>
+        <w:rPr>
+          <w:rFonts w:ascii="Times New Roman" w:hAnsi="Times New Roman"/>
+        </w:rPr>
+        <w:t xml:space="preserve"> </w:t>
+      </w:r>
+      <w:hyperlink r:id="rId201">
+        <w:r>
+          <w:rPr>
+            <w:rStyle w:val="Hyperlink"/>
+          </w:rPr>
+          <w:t xml:space="preserve">https://doi.org/10.1073/pnas.191367098</w:t>
+        </w:r>
+      </w:hyperlink>
+      <w:r>
+        <w:rPr>
+          <w:rFonts w:ascii="Times New Roman" w:hAnsi="Times New Roman"/>
+        </w:rPr>
+        <w:t xml:space="preserve">.</w:t>
+      </w:r>
+    </w:p>
+    <w:bookmarkEnd w:id="202"/>
+    <w:bookmarkStart w:id="204" w:name="ref-sparano2018"/>
     <w:p>
       <w:pPr>
         <w:pStyle w:val="Bibliografia"/>
@@ -14747,9 +15367,29 @@
         </w:rPr>
         <w:t xml:space="preserve">379 (2): 111–21.</w:t>
       </w:r>
-    </w:p>
-    <w:bookmarkEnd w:id="172"/>
-    <w:bookmarkStart w:id="173" w:name="ref-therneau2000"/>
+      <w:r>
+        <w:rPr>
+          <w:rFonts w:ascii="Times New Roman" w:hAnsi="Times New Roman"/>
+        </w:rPr>
+        <w:t xml:space="preserve"> </w:t>
+      </w:r>
+      <w:hyperlink r:id="rId203">
+        <w:r>
+          <w:rPr>
+            <w:rStyle w:val="Hyperlink"/>
+          </w:rPr>
+          <w:t xml:space="preserve">https://doi.org/10.1056/NEJMoa1804710</w:t>
+        </w:r>
+      </w:hyperlink>
+      <w:r>
+        <w:rPr>
+          <w:rFonts w:ascii="Times New Roman" w:hAnsi="Times New Roman"/>
+        </w:rPr>
+        <w:t xml:space="preserve">.</w:t>
+      </w:r>
+    </w:p>
+    <w:bookmarkEnd w:id="204"/>
+    <w:bookmarkStart w:id="206" w:name="ref-therneau2000"/>
     <w:p>
       <w:pPr>
         <w:pStyle w:val="Bibliografia"/>
@@ -14805,9 +15445,29 @@
         </w:rPr>
         <w:t xml:space="preserve">. New York: Springer.</w:t>
       </w:r>
-    </w:p>
-    <w:bookmarkEnd w:id="173"/>
-    <w:bookmarkStart w:id="174" w:name="ref-tibshirani1997"/>
+      <w:r>
+        <w:rPr>
+          <w:rFonts w:ascii="Times New Roman" w:hAnsi="Times New Roman"/>
+        </w:rPr>
+        <w:t xml:space="preserve"> </w:t>
+      </w:r>
+      <w:hyperlink r:id="rId205">
+        <w:r>
+          <w:rPr>
+            <w:rStyle w:val="Hyperlink"/>
+          </w:rPr>
+          <w:t xml:space="preserve">https://doi.org/10.1007/978-1-4757-3294-8</w:t>
+        </w:r>
+      </w:hyperlink>
+      <w:r>
+        <w:rPr>
+          <w:rFonts w:ascii="Times New Roman" w:hAnsi="Times New Roman"/>
+        </w:rPr>
+        <w:t xml:space="preserve">.</w:t>
+      </w:r>
+    </w:p>
+    <w:bookmarkEnd w:id="206"/>
+    <w:bookmarkStart w:id="208" w:name="ref-tibshirani1997"/>
     <w:p>
       <w:pPr>
         <w:pStyle w:val="Bibliografia"/>
@@ -14875,9 +15535,29 @@
         </w:rPr>
         <w:t xml:space="preserve">16 (4): 385–95.</w:t>
       </w:r>
-    </w:p>
-    <w:bookmarkEnd w:id="174"/>
-    <w:bookmarkStart w:id="175" w:name="ref-uno2011"/>
+      <w:r>
+        <w:rPr>
+          <w:rFonts w:ascii="Times New Roman" w:hAnsi="Times New Roman"/>
+        </w:rPr>
+        <w:t xml:space="preserve"> </w:t>
+      </w:r>
+      <w:hyperlink r:id="rId207">
+        <w:r>
+          <w:rPr>
+            <w:rStyle w:val="Hyperlink"/>
+          </w:rPr>
+          <w:t xml:space="preserve">https://doi.org/10.1002/(sici)1097-0258(19970228)16:4&lt;385::aid-sim380&gt;3.0.co;2-3</w:t>
+        </w:r>
+      </w:hyperlink>
+      <w:r>
+        <w:rPr>
+          <w:rFonts w:ascii="Times New Roman" w:hAnsi="Times New Roman"/>
+        </w:rPr>
+        <w:t xml:space="preserve">.</w:t>
+      </w:r>
+    </w:p>
+    <w:bookmarkEnd w:id="208"/>
+    <w:bookmarkStart w:id="210" w:name="ref-uno2011"/>
     <w:p>
       <w:pPr>
         <w:pStyle w:val="Bibliografia"/>
@@ -14945,9 +15625,29 @@
         </w:rPr>
         <w:t xml:space="preserve">30 (10): 1105–17.</w:t>
       </w:r>
-    </w:p>
-    <w:bookmarkEnd w:id="175"/>
-    <w:bookmarkStart w:id="176" w:name="ref-vantveer2002"/>
+      <w:r>
+        <w:rPr>
+          <w:rFonts w:ascii="Times New Roman" w:hAnsi="Times New Roman"/>
+        </w:rPr>
+        <w:t xml:space="preserve"> </w:t>
+      </w:r>
+      <w:hyperlink r:id="rId209">
+        <w:r>
+          <w:rPr>
+            <w:rStyle w:val="Hyperlink"/>
+          </w:rPr>
+          <w:t xml:space="preserve">https://doi.org/10.1002/sim.4154</w:t>
+        </w:r>
+      </w:hyperlink>
+      <w:r>
+        <w:rPr>
+          <w:rFonts w:ascii="Times New Roman" w:hAnsi="Times New Roman"/>
+        </w:rPr>
+        <w:t xml:space="preserve">.</w:t>
+      </w:r>
+    </w:p>
+    <w:bookmarkEnd w:id="210"/>
+    <w:bookmarkStart w:id="212" w:name="ref-vantveer2002"/>
     <w:p>
       <w:pPr>
         <w:pStyle w:val="Bibliografia"/>
@@ -14997,9 +15697,29 @@
         </w:rPr>
         <w:t xml:space="preserve">415 (6871): 530–36.</w:t>
       </w:r>
-    </w:p>
-    <w:bookmarkEnd w:id="176"/>
-    <w:bookmarkStart w:id="177" w:name="ref-vickers2006"/>
+      <w:r>
+        <w:rPr>
+          <w:rFonts w:ascii="Times New Roman" w:hAnsi="Times New Roman"/>
+        </w:rPr>
+        <w:t xml:space="preserve"> </w:t>
+      </w:r>
+      <w:hyperlink r:id="rId211">
+        <w:r>
+          <w:rPr>
+            <w:rStyle w:val="Hyperlink"/>
+          </w:rPr>
+          <w:t xml:space="preserve">https://doi.org/10.1038/415530a</w:t>
+        </w:r>
+      </w:hyperlink>
+      <w:r>
+        <w:rPr>
+          <w:rFonts w:ascii="Times New Roman" w:hAnsi="Times New Roman"/>
+        </w:rPr>
+        <w:t xml:space="preserve">.</w:t>
+      </w:r>
+    </w:p>
+    <w:bookmarkEnd w:id="212"/>
+    <w:bookmarkStart w:id="214" w:name="ref-vickers2006"/>
     <w:p>
       <w:pPr>
         <w:pStyle w:val="Bibliografia"/>
@@ -15049,9 +15769,29 @@
         </w:rPr>
         <w:t xml:space="preserve">26 (6): 565–74.</w:t>
       </w:r>
-    </w:p>
-    <w:bookmarkEnd w:id="177"/>
-    <w:bookmarkStart w:id="178" w:name="ref-viechtbauer2010"/>
+      <w:r>
+        <w:rPr>
+          <w:rFonts w:ascii="Times New Roman" w:hAnsi="Times New Roman"/>
+        </w:rPr>
+        <w:t xml:space="preserve"> </w:t>
+      </w:r>
+      <w:hyperlink r:id="rId213">
+        <w:r>
+          <w:rPr>
+            <w:rStyle w:val="Hyperlink"/>
+          </w:rPr>
+          <w:t xml:space="preserve">https://doi.org/10.1177/0272989x06295361</w:t>
+        </w:r>
+      </w:hyperlink>
+      <w:r>
+        <w:rPr>
+          <w:rFonts w:ascii="Times New Roman" w:hAnsi="Times New Roman"/>
+        </w:rPr>
+        <w:t xml:space="preserve">.</w:t>
+      </w:r>
+    </w:p>
+    <w:bookmarkEnd w:id="214"/>
+    <w:bookmarkStart w:id="216" w:name="ref-viechtbauer2010"/>
     <w:p>
       <w:pPr>
         <w:pStyle w:val="Bibliografia"/>
@@ -15125,9 +15865,29 @@
         </w:rPr>
         <w:t xml:space="preserve">36 (3): 1–48.</w:t>
       </w:r>
-    </w:p>
-    <w:bookmarkEnd w:id="178"/>
-    <w:bookmarkStart w:id="179" w:name="ref-wolf2022"/>
+      <w:r>
+        <w:rPr>
+          <w:rFonts w:ascii="Times New Roman" w:hAnsi="Times New Roman"/>
+        </w:rPr>
+        <w:t xml:space="preserve"> </w:t>
+      </w:r>
+      <w:hyperlink r:id="rId215">
+        <w:r>
+          <w:rPr>
+            <w:rStyle w:val="Hyperlink"/>
+          </w:rPr>
+          <w:t xml:space="preserve">https://doi.org/10.18637/jss.v036.i03</w:t>
+        </w:r>
+      </w:hyperlink>
+      <w:r>
+        <w:rPr>
+          <w:rFonts w:ascii="Times New Roman" w:hAnsi="Times New Roman"/>
+        </w:rPr>
+        <w:t xml:space="preserve">.</w:t>
+      </w:r>
+    </w:p>
+    <w:bookmarkEnd w:id="216"/>
+    <w:bookmarkStart w:id="218" w:name="ref-wolf2022"/>
     <w:p>
       <w:pPr>
         <w:pStyle w:val="Bibliografia"/>
@@ -15177,9 +15937,29 @@
         </w:rPr>
         <w:t xml:space="preserve">40 (6): 609–623.e6.</w:t>
       </w:r>
-    </w:p>
-    <w:bookmarkEnd w:id="179"/>
-    <w:bookmarkStart w:id="180" w:name="ref-zou2005"/>
+      <w:r>
+        <w:rPr>
+          <w:rFonts w:ascii="Times New Roman" w:hAnsi="Times New Roman"/>
+        </w:rPr>
+        <w:t xml:space="preserve"> </w:t>
+      </w:r>
+      <w:hyperlink r:id="rId217">
+        <w:r>
+          <w:rPr>
+            <w:rStyle w:val="Hyperlink"/>
+          </w:rPr>
+          <w:t xml:space="preserve">https://doi.org/10.1016/j.ccell.2022.05.005</w:t>
+        </w:r>
+      </w:hyperlink>
+      <w:r>
+        <w:rPr>
+          <w:rFonts w:ascii="Times New Roman" w:hAnsi="Times New Roman"/>
+        </w:rPr>
+        <w:t xml:space="preserve">.</w:t>
+      </w:r>
+    </w:p>
+    <w:bookmarkEnd w:id="218"/>
+    <w:bookmarkStart w:id="220" w:name="ref-zou2005"/>
     <w:p>
       <w:pPr>
         <w:pStyle w:val="Bibliografia"/>
@@ -15229,10 +16009,30 @@
         </w:rPr>
         <w:t xml:space="preserve">67 (2): 301–20.</w:t>
       </w:r>
-    </w:p>
-    <w:bookmarkEnd w:id="180"/>
-    <w:bookmarkEnd w:id="181"/>
-    <w:bookmarkEnd w:id="182"/>
+      <w:r>
+        <w:rPr>
+          <w:rFonts w:ascii="Times New Roman" w:hAnsi="Times New Roman"/>
+        </w:rPr>
+        <w:t xml:space="preserve"> </w:t>
+      </w:r>
+      <w:hyperlink r:id="rId219">
+        <w:r>
+          <w:rPr>
+            <w:rStyle w:val="Hyperlink"/>
+          </w:rPr>
+          <w:t xml:space="preserve">https://doi.org/10.1111/j.1467-9868.2005.00503.x</w:t>
+        </w:r>
+      </w:hyperlink>
+      <w:r>
+        <w:rPr>
+          <w:rFonts w:ascii="Times New Roman" w:hAnsi="Times New Roman"/>
+        </w:rPr>
+        <w:t xml:space="preserve">.</w:t>
+      </w:r>
+    </w:p>
+    <w:bookmarkEnd w:id="220"/>
+    <w:bookmarkEnd w:id="221"/>
+    <w:bookmarkEnd w:id="222"/>
     <w:sectPr>
       <w:headerReference r:id="rId9" w:type="default"/>
       <w:footnotePr>

</xml_diff>